<commit_message>
Add graphviz flowcharts and completely reconstruct BCA project reports with exact layouts
</commit_message>
<xml_diff>
--- a/data/Generated_Reports/Practical_Project_Report.docx
+++ b/data/Generated_Reports/Practical_Project_Report.docx
@@ -9,7 +9,9 @@
       </w:pPr>
       <w:r>
         <w:rPr>
-          <w:u w:val="single"/>
+          <w:rFonts w:ascii="Times New Roman" w:hAnsi="Times New Roman"/>
+          <w:b/>
+          <w:color w:val="000000"/>
         </w:rPr>
         <w:t>CONTENTS</w:t>
       </w:r>
@@ -19,7 +21,6 @@
       <w:tblPr>
         <w:tblStyle w:val="TableGrid"/>
         <w:tblW w:type="auto" w:w="0"/>
-        <w:jc w:val="center"/>
         <w:tblLook w:firstColumn="1" w:firstRow="1" w:lastColumn="0" w:lastRow="0" w:noHBand="0" w:noVBand="1" w:val="04A0"/>
       </w:tblPr>
       <w:tblGrid>
@@ -30,11 +31,12 @@
       <w:tr>
         <w:tc>
           <w:tcPr>
-            <w:tcW w:type="dxa" w:w="1152"/>
+            <w:tcW w:type="dxa" w:w="2880"/>
           </w:tcPr>
           <w:p>
             <w:r>
               <w:rPr>
+                <w:rFonts w:ascii="Times New Roman" w:hAnsi="Times New Roman"/>
                 <w:b/>
               </w:rPr>
               <w:t>Sr. No.</w:t>
@@ -43,11 +45,12 @@
         </w:tc>
         <w:tc>
           <w:tcPr>
-            <w:tcW w:type="dxa" w:w="6480"/>
+            <w:tcW w:type="dxa" w:w="2880"/>
           </w:tcPr>
           <w:p>
             <w:r>
               <w:rPr>
+                <w:rFonts w:ascii="Times New Roman" w:hAnsi="Times New Roman"/>
                 <w:b/>
               </w:rPr>
               <w:t>CHAPTER</w:t>
@@ -56,11 +59,12 @@
         </w:tc>
         <w:tc>
           <w:tcPr>
-            <w:tcW w:type="dxa" w:w="1152"/>
+            <w:tcW w:type="dxa" w:w="2880"/>
           </w:tcPr>
           <w:p>
             <w:r>
               <w:rPr>
+                <w:rFonts w:ascii="Times New Roman" w:hAnsi="Times New Roman"/>
                 <w:b/>
               </w:rPr>
               <w:t>Page No</w:t>
@@ -71,101 +75,12 @@
       <w:tr>
         <w:tc>
           <w:tcPr>
-            <w:tcW w:type="dxa" w:w="1152"/>
-          </w:tcPr>
-          <w:p>
-            <w:r/>
-          </w:p>
-        </w:tc>
-        <w:tc>
-          <w:tcPr>
-            <w:tcW w:type="dxa" w:w="6480"/>
-          </w:tcPr>
-          <w:p>
-            <w:r>
-              <w:t>ABSTRACT</w:t>
-            </w:r>
-          </w:p>
-        </w:tc>
-        <w:tc>
-          <w:tcPr>
-            <w:tcW w:type="dxa" w:w="1152"/>
-          </w:tcPr>
-          <w:p>
-            <w:r>
-              <w:t>I</w:t>
-            </w:r>
-          </w:p>
-        </w:tc>
-      </w:tr>
-      <w:tr>
-        <w:tc>
-          <w:tcPr>
-            <w:tcW w:type="dxa" w:w="1152"/>
-          </w:tcPr>
-          <w:p>
-            <w:r/>
-          </w:p>
-        </w:tc>
-        <w:tc>
-          <w:tcPr>
-            <w:tcW w:type="dxa" w:w="6480"/>
-          </w:tcPr>
-          <w:p>
-            <w:r>
-              <w:t>LIST OF FIGURES</w:t>
-            </w:r>
-          </w:p>
-        </w:tc>
-        <w:tc>
-          <w:tcPr>
-            <w:tcW w:type="dxa" w:w="1152"/>
-          </w:tcPr>
-          <w:p>
-            <w:r>
-              <w:t>II</w:t>
-            </w:r>
-          </w:p>
-        </w:tc>
-      </w:tr>
-      <w:tr>
-        <w:tc>
-          <w:tcPr>
-            <w:tcW w:type="dxa" w:w="1152"/>
-          </w:tcPr>
-          <w:p>
-            <w:r/>
-          </w:p>
-        </w:tc>
-        <w:tc>
-          <w:tcPr>
-            <w:tcW w:type="dxa" w:w="6480"/>
-          </w:tcPr>
-          <w:p>
-            <w:r>
-              <w:t>LIST OF TABLES</w:t>
-            </w:r>
-          </w:p>
-        </w:tc>
-        <w:tc>
-          <w:tcPr>
-            <w:tcW w:type="dxa" w:w="1152"/>
-          </w:tcPr>
-          <w:p>
-            <w:r>
-              <w:t>III</w:t>
-            </w:r>
-          </w:p>
-        </w:tc>
-      </w:tr>
-      <w:tr>
-        <w:tc>
-          <w:tcPr>
-            <w:tcW w:type="dxa" w:w="1152"/>
+            <w:tcW w:type="dxa" w:w="2880"/>
           </w:tcPr>
           <w:p>
             <w:r>
               <w:rPr>
+                <w:rFonts w:ascii="Times New Roman" w:hAnsi="Times New Roman"/>
                 <w:b/>
               </w:rPr>
               <w:t>1</w:t>
@@ -174,11 +89,12 @@
         </w:tc>
         <w:tc>
           <w:tcPr>
-            <w:tcW w:type="dxa" w:w="6480"/>
+            <w:tcW w:type="dxa" w:w="2880"/>
           </w:tcPr>
           <w:p>
             <w:r>
               <w:rPr>
+                <w:rFonts w:ascii="Times New Roman" w:hAnsi="Times New Roman"/>
                 <w:b/>
               </w:rPr>
               <w:t>BRIEF REVIEW OF THE PROJECT</w:t>
@@ -187,11 +103,12 @@
         </w:tc>
         <w:tc>
           <w:tcPr>
-            <w:tcW w:type="dxa" w:w="1152"/>
+            <w:tcW w:type="dxa" w:w="2880"/>
           </w:tcPr>
           <w:p>
             <w:r>
               <w:rPr>
+                <w:rFonts w:ascii="Times New Roman" w:hAnsi="Times New Roman"/>
                 <w:b/>
               </w:rPr>
             </w:r>
@@ -201,28 +118,38 @@
       <w:tr>
         <w:tc>
           <w:tcPr>
-            <w:tcW w:type="dxa" w:w="1152"/>
+            <w:tcW w:type="dxa" w:w="2880"/>
           </w:tcPr>
           <w:p>
-            <w:r/>
+            <w:r>
+              <w:rPr>
+                <w:rFonts w:ascii="Times New Roman" w:hAnsi="Times New Roman"/>
+              </w:rPr>
+            </w:r>
           </w:p>
         </w:tc>
         <w:tc>
           <w:tcPr>
-            <w:tcW w:type="dxa" w:w="6480"/>
+            <w:tcW w:type="dxa" w:w="2880"/>
           </w:tcPr>
           <w:p>
             <w:r>
+              <w:rPr>
+                <w:rFonts w:ascii="Times New Roman" w:hAnsi="Times New Roman"/>
+              </w:rPr>
               <w:t>1.1 TITLE</w:t>
             </w:r>
           </w:p>
         </w:tc>
         <w:tc>
           <w:tcPr>
-            <w:tcW w:type="dxa" w:w="1152"/>
+            <w:tcW w:type="dxa" w:w="2880"/>
           </w:tcPr>
           <w:p>
             <w:r>
+              <w:rPr>
+                <w:rFonts w:ascii="Times New Roman" w:hAnsi="Times New Roman"/>
+              </w:rPr>
               <w:t>1</w:t>
             </w:r>
           </w:p>
@@ -231,28 +158,38 @@
       <w:tr>
         <w:tc>
           <w:tcPr>
-            <w:tcW w:type="dxa" w:w="1152"/>
+            <w:tcW w:type="dxa" w:w="2880"/>
           </w:tcPr>
           <w:p>
-            <w:r/>
+            <w:r>
+              <w:rPr>
+                <w:rFonts w:ascii="Times New Roman" w:hAnsi="Times New Roman"/>
+              </w:rPr>
+            </w:r>
           </w:p>
         </w:tc>
         <w:tc>
           <w:tcPr>
-            <w:tcW w:type="dxa" w:w="6480"/>
+            <w:tcW w:type="dxa" w:w="2880"/>
           </w:tcPr>
           <w:p>
             <w:r>
+              <w:rPr>
+                <w:rFonts w:ascii="Times New Roman" w:hAnsi="Times New Roman"/>
+              </w:rPr>
               <w:t>1.2 INTRODUCTION / OBJECTIVE</w:t>
             </w:r>
           </w:p>
         </w:tc>
         <w:tc>
           <w:tcPr>
-            <w:tcW w:type="dxa" w:w="1152"/>
+            <w:tcW w:type="dxa" w:w="2880"/>
           </w:tcPr>
           <w:p>
             <w:r>
+              <w:rPr>
+                <w:rFonts w:ascii="Times New Roman" w:hAnsi="Times New Roman"/>
+              </w:rPr>
               <w:t>2</w:t>
             </w:r>
           </w:p>
@@ -261,28 +198,38 @@
       <w:tr>
         <w:tc>
           <w:tcPr>
-            <w:tcW w:type="dxa" w:w="1152"/>
+            <w:tcW w:type="dxa" w:w="2880"/>
           </w:tcPr>
           <w:p>
-            <w:r/>
+            <w:r>
+              <w:rPr>
+                <w:rFonts w:ascii="Times New Roman" w:hAnsi="Times New Roman"/>
+              </w:rPr>
+            </w:r>
           </w:p>
         </w:tc>
         <w:tc>
           <w:tcPr>
-            <w:tcW w:type="dxa" w:w="6480"/>
+            <w:tcW w:type="dxa" w:w="2880"/>
           </w:tcPr>
           <w:p>
             <w:r>
+              <w:rPr>
+                <w:rFonts w:ascii="Times New Roman" w:hAnsi="Times New Roman"/>
+              </w:rPr>
               <w:t>1.3 PRELIMINARY INVESTIGATION</w:t>
             </w:r>
           </w:p>
         </w:tc>
         <w:tc>
           <w:tcPr>
-            <w:tcW w:type="dxa" w:w="1152"/>
+            <w:tcW w:type="dxa" w:w="2880"/>
           </w:tcPr>
           <w:p>
             <w:r>
+              <w:rPr>
+                <w:rFonts w:ascii="Times New Roman" w:hAnsi="Times New Roman"/>
+              </w:rPr>
               <w:t>3</w:t>
             </w:r>
           </w:p>
@@ -291,28 +238,38 @@
       <w:tr>
         <w:tc>
           <w:tcPr>
-            <w:tcW w:type="dxa" w:w="1152"/>
+            <w:tcW w:type="dxa" w:w="2880"/>
           </w:tcPr>
           <w:p>
-            <w:r/>
+            <w:r>
+              <w:rPr>
+                <w:rFonts w:ascii="Times New Roman" w:hAnsi="Times New Roman"/>
+              </w:rPr>
+            </w:r>
           </w:p>
         </w:tc>
         <w:tc>
           <w:tcPr>
-            <w:tcW w:type="dxa" w:w="6480"/>
+            <w:tcW w:type="dxa" w:w="2880"/>
           </w:tcPr>
           <w:p>
             <w:r>
+              <w:rPr>
+                <w:rFonts w:ascii="Times New Roman" w:hAnsi="Times New Roman"/>
+              </w:rPr>
               <w:t>1.4 FLAWS IN PRESENT SYSTEM</w:t>
             </w:r>
           </w:p>
         </w:tc>
         <w:tc>
           <w:tcPr>
-            <w:tcW w:type="dxa" w:w="1152"/>
+            <w:tcW w:type="dxa" w:w="2880"/>
           </w:tcPr>
           <w:p>
             <w:r>
+              <w:rPr>
+                <w:rFonts w:ascii="Times New Roman" w:hAnsi="Times New Roman"/>
+              </w:rPr>
               <w:t>4</w:t>
             </w:r>
           </w:p>
@@ -321,28 +278,38 @@
       <w:tr>
         <w:tc>
           <w:tcPr>
-            <w:tcW w:type="dxa" w:w="1152"/>
+            <w:tcW w:type="dxa" w:w="2880"/>
           </w:tcPr>
           <w:p>
-            <w:r/>
+            <w:r>
+              <w:rPr>
+                <w:rFonts w:ascii="Times New Roman" w:hAnsi="Times New Roman"/>
+              </w:rPr>
+            </w:r>
           </w:p>
         </w:tc>
         <w:tc>
           <w:tcPr>
-            <w:tcW w:type="dxa" w:w="6480"/>
+            <w:tcW w:type="dxa" w:w="2880"/>
           </w:tcPr>
           <w:p>
             <w:r>
+              <w:rPr>
+                <w:rFonts w:ascii="Times New Roman" w:hAnsi="Times New Roman"/>
+              </w:rPr>
               <w:t>1.5 NEED OF NEW SYSTEM</w:t>
             </w:r>
           </w:p>
         </w:tc>
         <w:tc>
           <w:tcPr>
-            <w:tcW w:type="dxa" w:w="1152"/>
+            <w:tcW w:type="dxa" w:w="2880"/>
           </w:tcPr>
           <w:p>
             <w:r>
+              <w:rPr>
+                <w:rFonts w:ascii="Times New Roman" w:hAnsi="Times New Roman"/>
+              </w:rPr>
               <w:t>5</w:t>
             </w:r>
           </w:p>
@@ -351,11 +318,12 @@
       <w:tr>
         <w:tc>
           <w:tcPr>
-            <w:tcW w:type="dxa" w:w="1152"/>
+            <w:tcW w:type="dxa" w:w="2880"/>
           </w:tcPr>
           <w:p>
             <w:r>
               <w:rPr>
+                <w:rFonts w:ascii="Times New Roman" w:hAnsi="Times New Roman"/>
                 <w:b/>
               </w:rPr>
               <w:t>2</w:t>
@@ -364,11 +332,12 @@
         </w:tc>
         <w:tc>
           <w:tcPr>
-            <w:tcW w:type="dxa" w:w="6480"/>
+            <w:tcW w:type="dxa" w:w="2880"/>
           </w:tcPr>
           <w:p>
             <w:r>
               <w:rPr>
+                <w:rFonts w:ascii="Times New Roman" w:hAnsi="Times New Roman"/>
                 <w:b/>
               </w:rPr>
               <w:t>DETAILED SYSTEM DESIGN</w:t>
@@ -377,11 +346,12 @@
         </w:tc>
         <w:tc>
           <w:tcPr>
-            <w:tcW w:type="dxa" w:w="1152"/>
+            <w:tcW w:type="dxa" w:w="2880"/>
           </w:tcPr>
           <w:p>
             <w:r>
               <w:rPr>
+                <w:rFonts w:ascii="Times New Roman" w:hAnsi="Times New Roman"/>
                 <w:b/>
               </w:rPr>
             </w:r>
@@ -391,28 +361,38 @@
       <w:tr>
         <w:tc>
           <w:tcPr>
-            <w:tcW w:type="dxa" w:w="1152"/>
+            <w:tcW w:type="dxa" w:w="2880"/>
           </w:tcPr>
           <w:p>
-            <w:r/>
+            <w:r>
+              <w:rPr>
+                <w:rFonts w:ascii="Times New Roman" w:hAnsi="Times New Roman"/>
+              </w:rPr>
+            </w:r>
           </w:p>
         </w:tc>
         <w:tc>
           <w:tcPr>
-            <w:tcW w:type="dxa" w:w="6480"/>
+            <w:tcW w:type="dxa" w:w="2880"/>
           </w:tcPr>
           <w:p>
             <w:r>
+              <w:rPr>
+                <w:rFonts w:ascii="Times New Roman" w:hAnsi="Times New Roman"/>
+              </w:rPr>
               <w:t>2.1 SYSTEM FLOW CHART</w:t>
             </w:r>
           </w:p>
         </w:tc>
         <w:tc>
           <w:tcPr>
-            <w:tcW w:type="dxa" w:w="1152"/>
+            <w:tcW w:type="dxa" w:w="2880"/>
           </w:tcPr>
           <w:p>
             <w:r>
+              <w:rPr>
+                <w:rFonts w:ascii="Times New Roman" w:hAnsi="Times New Roman"/>
+              </w:rPr>
               <w:t>6</w:t>
             </w:r>
           </w:p>
@@ -421,28 +401,38 @@
       <w:tr>
         <w:tc>
           <w:tcPr>
-            <w:tcW w:type="dxa" w:w="1152"/>
+            <w:tcW w:type="dxa" w:w="2880"/>
           </w:tcPr>
           <w:p>
-            <w:r/>
+            <w:r>
+              <w:rPr>
+                <w:rFonts w:ascii="Times New Roman" w:hAnsi="Times New Roman"/>
+              </w:rPr>
+            </w:r>
           </w:p>
         </w:tc>
         <w:tc>
           <w:tcPr>
-            <w:tcW w:type="dxa" w:w="6480"/>
+            <w:tcW w:type="dxa" w:w="2880"/>
           </w:tcPr>
           <w:p>
             <w:r>
+              <w:rPr>
+                <w:rFonts w:ascii="Times New Roman" w:hAnsi="Times New Roman"/>
+              </w:rPr>
               <w:t>2.2 DETAILS OF LOGIC DEVELOPED</w:t>
             </w:r>
           </w:p>
         </w:tc>
         <w:tc>
           <w:tcPr>
-            <w:tcW w:type="dxa" w:w="1152"/>
+            <w:tcW w:type="dxa" w:w="2880"/>
           </w:tcPr>
           <w:p>
             <w:r>
+              <w:rPr>
+                <w:rFonts w:ascii="Times New Roman" w:hAnsi="Times New Roman"/>
+              </w:rPr>
               <w:t>7</w:t>
             </w:r>
           </w:p>
@@ -451,28 +441,38 @@
       <w:tr>
         <w:tc>
           <w:tcPr>
-            <w:tcW w:type="dxa" w:w="1152"/>
+            <w:tcW w:type="dxa" w:w="2880"/>
           </w:tcPr>
           <w:p>
-            <w:r/>
+            <w:r>
+              <w:rPr>
+                <w:rFonts w:ascii="Times New Roman" w:hAnsi="Times New Roman"/>
+              </w:rPr>
+            </w:r>
           </w:p>
         </w:tc>
         <w:tc>
           <w:tcPr>
-            <w:tcW w:type="dxa" w:w="6480"/>
+            <w:tcW w:type="dxa" w:w="2880"/>
           </w:tcPr>
           <w:p>
             <w:r>
+              <w:rPr>
+                <w:rFonts w:ascii="Times New Roman" w:hAnsi="Times New Roman"/>
+              </w:rPr>
               <w:t>2.3 STRUCTURE DIAGRAM OF EACH MODULE</w:t>
             </w:r>
           </w:p>
         </w:tc>
         <w:tc>
           <w:tcPr>
-            <w:tcW w:type="dxa" w:w="1152"/>
+            <w:tcW w:type="dxa" w:w="2880"/>
           </w:tcPr>
           <w:p>
             <w:r>
+              <w:rPr>
+                <w:rFonts w:ascii="Times New Roman" w:hAnsi="Times New Roman"/>
+              </w:rPr>
               <w:t>9</w:t>
             </w:r>
           </w:p>
@@ -481,28 +481,38 @@
       <w:tr>
         <w:tc>
           <w:tcPr>
-            <w:tcW w:type="dxa" w:w="1152"/>
+            <w:tcW w:type="dxa" w:w="2880"/>
           </w:tcPr>
           <w:p>
-            <w:r/>
+            <w:r>
+              <w:rPr>
+                <w:rFonts w:ascii="Times New Roman" w:hAnsi="Times New Roman"/>
+              </w:rPr>
+            </w:r>
           </w:p>
         </w:tc>
         <w:tc>
           <w:tcPr>
-            <w:tcW w:type="dxa" w:w="6480"/>
+            <w:tcW w:type="dxa" w:w="2880"/>
           </w:tcPr>
           <w:p>
             <w:r>
+              <w:rPr>
+                <w:rFonts w:ascii="Times New Roman" w:hAnsi="Times New Roman"/>
+              </w:rPr>
               <w:t>2.4 DATA DICTIONARY</w:t>
             </w:r>
           </w:p>
         </w:tc>
         <w:tc>
           <w:tcPr>
-            <w:tcW w:type="dxa" w:w="1152"/>
+            <w:tcW w:type="dxa" w:w="2880"/>
           </w:tcPr>
           <w:p>
             <w:r>
+              <w:rPr>
+                <w:rFonts w:ascii="Times New Roman" w:hAnsi="Times New Roman"/>
+              </w:rPr>
               <w:t>10</w:t>
             </w:r>
           </w:p>
@@ -511,28 +521,38 @@
       <w:tr>
         <w:tc>
           <w:tcPr>
-            <w:tcW w:type="dxa" w:w="1152"/>
+            <w:tcW w:type="dxa" w:w="2880"/>
           </w:tcPr>
           <w:p>
-            <w:r/>
+            <w:r>
+              <w:rPr>
+                <w:rFonts w:ascii="Times New Roman" w:hAnsi="Times New Roman"/>
+              </w:rPr>
+            </w:r>
           </w:p>
         </w:tc>
         <w:tc>
           <w:tcPr>
-            <w:tcW w:type="dxa" w:w="6480"/>
+            <w:tcW w:type="dxa" w:w="2880"/>
           </w:tcPr>
           <w:p>
             <w:r>
+              <w:rPr>
+                <w:rFonts w:ascii="Times New Roman" w:hAnsi="Times New Roman"/>
+              </w:rPr>
               <w:t>2.5 DATA FLOW DIAGRAMS</w:t>
             </w:r>
           </w:p>
         </w:tc>
         <w:tc>
           <w:tcPr>
-            <w:tcW w:type="dxa" w:w="1152"/>
+            <w:tcW w:type="dxa" w:w="2880"/>
           </w:tcPr>
           <w:p>
             <w:r>
+              <w:rPr>
+                <w:rFonts w:ascii="Times New Roman" w:hAnsi="Times New Roman"/>
+              </w:rPr>
               <w:t>12</w:t>
             </w:r>
           </w:p>
@@ -541,11 +561,12 @@
       <w:tr>
         <w:tc>
           <w:tcPr>
-            <w:tcW w:type="dxa" w:w="1152"/>
+            <w:tcW w:type="dxa" w:w="2880"/>
           </w:tcPr>
           <w:p>
             <w:r>
               <w:rPr>
+                <w:rFonts w:ascii="Times New Roman" w:hAnsi="Times New Roman"/>
                 <w:b/>
               </w:rPr>
               <w:t>3</w:t>
@@ -554,11 +575,12 @@
         </w:tc>
         <w:tc>
           <w:tcPr>
-            <w:tcW w:type="dxa" w:w="6480"/>
+            <w:tcW w:type="dxa" w:w="2880"/>
           </w:tcPr>
           <w:p>
             <w:r>
               <w:rPr>
+                <w:rFonts w:ascii="Times New Roman" w:hAnsi="Times New Roman"/>
                 <w:b/>
               </w:rPr>
               <w:t>SOFTWARE/ HARDWARE DETAILS</w:t>
@@ -567,11 +589,12 @@
         </w:tc>
         <w:tc>
           <w:tcPr>
-            <w:tcW w:type="dxa" w:w="1152"/>
+            <w:tcW w:type="dxa" w:w="2880"/>
           </w:tcPr>
           <w:p>
             <w:r>
               <w:rPr>
+                <w:rFonts w:ascii="Times New Roman" w:hAnsi="Times New Roman"/>
                 <w:b/>
               </w:rPr>
             </w:r>
@@ -581,28 +604,38 @@
       <w:tr>
         <w:tc>
           <w:tcPr>
-            <w:tcW w:type="dxa" w:w="1152"/>
+            <w:tcW w:type="dxa" w:w="2880"/>
           </w:tcPr>
           <w:p>
-            <w:r/>
+            <w:r>
+              <w:rPr>
+                <w:rFonts w:ascii="Times New Roman" w:hAnsi="Times New Roman"/>
+              </w:rPr>
+            </w:r>
           </w:p>
         </w:tc>
         <w:tc>
           <w:tcPr>
-            <w:tcW w:type="dxa" w:w="6480"/>
+            <w:tcW w:type="dxa" w:w="2880"/>
           </w:tcPr>
           <w:p>
             <w:r>
+              <w:rPr>
+                <w:rFonts w:ascii="Times New Roman" w:hAnsi="Times New Roman"/>
+              </w:rPr>
               <w:t>3.1 CHOICE OF A LANGUAGE USED</w:t>
             </w:r>
           </w:p>
         </w:tc>
         <w:tc>
           <w:tcPr>
-            <w:tcW w:type="dxa" w:w="1152"/>
+            <w:tcW w:type="dxa" w:w="2880"/>
           </w:tcPr>
           <w:p>
             <w:r>
+              <w:rPr>
+                <w:rFonts w:ascii="Times New Roman" w:hAnsi="Times New Roman"/>
+              </w:rPr>
               <w:t>14</w:t>
             </w:r>
           </w:p>
@@ -611,28 +644,38 @@
       <w:tr>
         <w:tc>
           <w:tcPr>
-            <w:tcW w:type="dxa" w:w="1152"/>
+            <w:tcW w:type="dxa" w:w="2880"/>
           </w:tcPr>
           <w:p>
-            <w:r/>
+            <w:r>
+              <w:rPr>
+                <w:rFonts w:ascii="Times New Roman" w:hAnsi="Times New Roman"/>
+              </w:rPr>
+            </w:r>
           </w:p>
         </w:tc>
         <w:tc>
           <w:tcPr>
-            <w:tcW w:type="dxa" w:w="6480"/>
+            <w:tcW w:type="dxa" w:w="2880"/>
           </w:tcPr>
           <w:p>
             <w:r>
+              <w:rPr>
+                <w:rFonts w:ascii="Times New Roman" w:hAnsi="Times New Roman"/>
+              </w:rPr>
               <w:t>3.2 HARDWARE/ SOFTWARE SPECIFICATION</w:t>
             </w:r>
           </w:p>
         </w:tc>
         <w:tc>
           <w:tcPr>
-            <w:tcW w:type="dxa" w:w="1152"/>
+            <w:tcW w:type="dxa" w:w="2880"/>
           </w:tcPr>
           <w:p>
             <w:r>
+              <w:rPr>
+                <w:rFonts w:ascii="Times New Roman" w:hAnsi="Times New Roman"/>
+              </w:rPr>
               <w:t>15</w:t>
             </w:r>
           </w:p>
@@ -641,11 +684,12 @@
       <w:tr>
         <w:tc>
           <w:tcPr>
-            <w:tcW w:type="dxa" w:w="1152"/>
+            <w:tcW w:type="dxa" w:w="2880"/>
           </w:tcPr>
           <w:p>
             <w:r>
               <w:rPr>
+                <w:rFonts w:ascii="Times New Roman" w:hAnsi="Times New Roman"/>
                 <w:b/>
               </w:rPr>
               <w:t>4</w:t>
@@ -654,11 +698,12 @@
         </w:tc>
         <w:tc>
           <w:tcPr>
-            <w:tcW w:type="dxa" w:w="6480"/>
+            <w:tcW w:type="dxa" w:w="2880"/>
           </w:tcPr>
           <w:p>
             <w:r>
               <w:rPr>
+                <w:rFonts w:ascii="Times New Roman" w:hAnsi="Times New Roman"/>
                 <w:b/>
               </w:rPr>
               <w:t>SYSTEM DESIGN</w:t>
@@ -667,11 +712,12 @@
         </w:tc>
         <w:tc>
           <w:tcPr>
-            <w:tcW w:type="dxa" w:w="1152"/>
+            <w:tcW w:type="dxa" w:w="2880"/>
           </w:tcPr>
           <w:p>
             <w:r>
               <w:rPr>
+                <w:rFonts w:ascii="Times New Roman" w:hAnsi="Times New Roman"/>
                 <w:b/>
               </w:rPr>
             </w:r>
@@ -681,28 +727,38 @@
       <w:tr>
         <w:tc>
           <w:tcPr>
-            <w:tcW w:type="dxa" w:w="1152"/>
+            <w:tcW w:type="dxa" w:w="2880"/>
           </w:tcPr>
           <w:p>
-            <w:r/>
+            <w:r>
+              <w:rPr>
+                <w:rFonts w:ascii="Times New Roman" w:hAnsi="Times New Roman"/>
+              </w:rPr>
+            </w:r>
           </w:p>
         </w:tc>
         <w:tc>
           <w:tcPr>
-            <w:tcW w:type="dxa" w:w="6480"/>
+            <w:tcW w:type="dxa" w:w="2880"/>
           </w:tcPr>
           <w:p>
             <w:r>
+              <w:rPr>
+                <w:rFonts w:ascii="Times New Roman" w:hAnsi="Times New Roman"/>
+              </w:rPr>
               <w:t>4.1 PROGRAM LISTING</w:t>
             </w:r>
           </w:p>
         </w:tc>
         <w:tc>
           <w:tcPr>
-            <w:tcW w:type="dxa" w:w="1152"/>
+            <w:tcW w:type="dxa" w:w="2880"/>
           </w:tcPr>
           <w:p>
             <w:r>
+              <w:rPr>
+                <w:rFonts w:ascii="Times New Roman" w:hAnsi="Times New Roman"/>
+              </w:rPr>
               <w:t>16</w:t>
             </w:r>
           </w:p>
@@ -711,28 +767,38 @@
       <w:tr>
         <w:tc>
           <w:tcPr>
-            <w:tcW w:type="dxa" w:w="1152"/>
+            <w:tcW w:type="dxa" w:w="2880"/>
           </w:tcPr>
           <w:p>
-            <w:r/>
+            <w:r>
+              <w:rPr>
+                <w:rFonts w:ascii="Times New Roman" w:hAnsi="Times New Roman"/>
+              </w:rPr>
+            </w:r>
           </w:p>
         </w:tc>
         <w:tc>
           <w:tcPr>
-            <w:tcW w:type="dxa" w:w="6480"/>
+            <w:tcW w:type="dxa" w:w="2880"/>
           </w:tcPr>
           <w:p>
             <w:r>
+              <w:rPr>
+                <w:rFonts w:ascii="Times New Roman" w:hAnsi="Times New Roman"/>
+              </w:rPr>
               <w:t>4.2 INPUT SCREENS</w:t>
             </w:r>
           </w:p>
         </w:tc>
         <w:tc>
           <w:tcPr>
-            <w:tcW w:type="dxa" w:w="1152"/>
+            <w:tcW w:type="dxa" w:w="2880"/>
           </w:tcPr>
           <w:p>
             <w:r>
+              <w:rPr>
+                <w:rFonts w:ascii="Times New Roman" w:hAnsi="Times New Roman"/>
+              </w:rPr>
               <w:t>18</w:t>
             </w:r>
           </w:p>
@@ -741,28 +807,38 @@
       <w:tr>
         <w:tc>
           <w:tcPr>
-            <w:tcW w:type="dxa" w:w="1152"/>
+            <w:tcW w:type="dxa" w:w="2880"/>
           </w:tcPr>
           <w:p>
-            <w:r/>
+            <w:r>
+              <w:rPr>
+                <w:rFonts w:ascii="Times New Roman" w:hAnsi="Times New Roman"/>
+              </w:rPr>
+            </w:r>
           </w:p>
         </w:tc>
         <w:tc>
           <w:tcPr>
-            <w:tcW w:type="dxa" w:w="6480"/>
+            <w:tcW w:type="dxa" w:w="2880"/>
           </w:tcPr>
           <w:p>
             <w:r>
+              <w:rPr>
+                <w:rFonts w:ascii="Times New Roman" w:hAnsi="Times New Roman"/>
+              </w:rPr>
               <w:t>4.3 OUTPUT SCREENS / REPORTS</w:t>
             </w:r>
           </w:p>
         </w:tc>
         <w:tc>
           <w:tcPr>
-            <w:tcW w:type="dxa" w:w="1152"/>
+            <w:tcW w:type="dxa" w:w="2880"/>
           </w:tcPr>
           <w:p>
             <w:r>
+              <w:rPr>
+                <w:rFonts w:ascii="Times New Roman" w:hAnsi="Times New Roman"/>
+              </w:rPr>
               <w:t>22</w:t>
             </w:r>
           </w:p>
@@ -771,11 +847,12 @@
       <w:tr>
         <w:tc>
           <w:tcPr>
-            <w:tcW w:type="dxa" w:w="1152"/>
+            <w:tcW w:type="dxa" w:w="2880"/>
           </w:tcPr>
           <w:p>
             <w:r>
               <w:rPr>
+                <w:rFonts w:ascii="Times New Roman" w:hAnsi="Times New Roman"/>
                 <w:b/>
               </w:rPr>
               <w:t>5</w:t>
@@ -784,11 +861,12 @@
         </w:tc>
         <w:tc>
           <w:tcPr>
-            <w:tcW w:type="dxa" w:w="6480"/>
+            <w:tcW w:type="dxa" w:w="2880"/>
           </w:tcPr>
           <w:p>
             <w:r>
               <w:rPr>
+                <w:rFonts w:ascii="Times New Roman" w:hAnsi="Times New Roman"/>
                 <w:b/>
               </w:rPr>
               <w:t>USER DOCUMENTATION</w:t>
@@ -797,11 +875,12 @@
         </w:tc>
         <w:tc>
           <w:tcPr>
-            <w:tcW w:type="dxa" w:w="1152"/>
+            <w:tcW w:type="dxa" w:w="2880"/>
           </w:tcPr>
           <w:p>
             <w:r>
               <w:rPr>
+                <w:rFonts w:ascii="Times New Roman" w:hAnsi="Times New Roman"/>
                 <w:b/>
               </w:rPr>
             </w:r>
@@ -811,28 +890,40 @@
       <w:tr>
         <w:tc>
           <w:tcPr>
-            <w:tcW w:type="dxa" w:w="1152"/>
-          </w:tcPr>
-          <w:p>
-            <w:r/>
-          </w:p>
-        </w:tc>
-        <w:tc>
-          <w:tcPr>
-            <w:tcW w:type="dxa" w:w="6480"/>
+            <w:tcW w:type="dxa" w:w="2880"/>
           </w:tcPr>
           <w:p>
             <w:r>
-              <w:t>5.1 IMPLEMENTATION, PROGRAM EXECUTION &amp; MAINTENANCE</w:t>
+              <w:rPr>
+                <w:rFonts w:ascii="Times New Roman" w:hAnsi="Times New Roman"/>
+              </w:rPr>
             </w:r>
           </w:p>
         </w:tc>
         <w:tc>
           <w:tcPr>
-            <w:tcW w:type="dxa" w:w="1152"/>
+            <w:tcW w:type="dxa" w:w="2880"/>
           </w:tcPr>
           <w:p>
             <w:r>
+              <w:rPr>
+                <w:rFonts w:ascii="Times New Roman" w:hAnsi="Times New Roman"/>
+              </w:rPr>
+              <w:t>5.1 IMPLEMENTATION, PROGRAM</w:t>
+              <w:br/>
+              <w:t>EXECUTION &amp; MAINTENANCE</w:t>
+            </w:r>
+          </w:p>
+        </w:tc>
+        <w:tc>
+          <w:tcPr>
+            <w:tcW w:type="dxa" w:w="2880"/>
+          </w:tcPr>
+          <w:p>
+            <w:r>
+              <w:rPr>
+                <w:rFonts w:ascii="Times New Roman" w:hAnsi="Times New Roman"/>
+              </w:rPr>
               <w:t>26</w:t>
             </w:r>
           </w:p>
@@ -841,11 +932,12 @@
       <w:tr>
         <w:tc>
           <w:tcPr>
-            <w:tcW w:type="dxa" w:w="1152"/>
+            <w:tcW w:type="dxa" w:w="2880"/>
           </w:tcPr>
           <w:p>
             <w:r>
               <w:rPr>
+                <w:rFonts w:ascii="Times New Roman" w:hAnsi="Times New Roman"/>
                 <w:b/>
               </w:rPr>
               <w:t>6</w:t>
@@ -854,11 +946,12 @@
         </w:tc>
         <w:tc>
           <w:tcPr>
-            <w:tcW w:type="dxa" w:w="6480"/>
+            <w:tcW w:type="dxa" w:w="2880"/>
           </w:tcPr>
           <w:p>
             <w:r>
               <w:rPr>
+                <w:rFonts w:ascii="Times New Roman" w:hAnsi="Times New Roman"/>
                 <w:b/>
               </w:rPr>
               <w:t>CONCLUSION</w:t>
@@ -867,11 +960,12 @@
         </w:tc>
         <w:tc>
           <w:tcPr>
-            <w:tcW w:type="dxa" w:w="1152"/>
+            <w:tcW w:type="dxa" w:w="2880"/>
           </w:tcPr>
           <w:p>
             <w:r>
               <w:rPr>
+                <w:rFonts w:ascii="Times New Roman" w:hAnsi="Times New Roman"/>
                 <w:b/>
               </w:rPr>
             </w:r>
@@ -881,28 +975,38 @@
       <w:tr>
         <w:tc>
           <w:tcPr>
-            <w:tcW w:type="dxa" w:w="1152"/>
+            <w:tcW w:type="dxa" w:w="2880"/>
           </w:tcPr>
           <w:p>
-            <w:r/>
+            <w:r>
+              <w:rPr>
+                <w:rFonts w:ascii="Times New Roman" w:hAnsi="Times New Roman"/>
+              </w:rPr>
+            </w:r>
           </w:p>
         </w:tc>
         <w:tc>
           <w:tcPr>
-            <w:tcW w:type="dxa" w:w="6480"/>
+            <w:tcW w:type="dxa" w:w="2880"/>
           </w:tcPr>
           <w:p>
             <w:r>
+              <w:rPr>
+                <w:rFonts w:ascii="Times New Roman" w:hAnsi="Times New Roman"/>
+              </w:rPr>
               <w:t>6.1 LIMITATIONS OF THE SYSTEM</w:t>
             </w:r>
           </w:p>
         </w:tc>
         <w:tc>
           <w:tcPr>
-            <w:tcW w:type="dxa" w:w="1152"/>
+            <w:tcW w:type="dxa" w:w="2880"/>
           </w:tcPr>
           <w:p>
             <w:r>
+              <w:rPr>
+                <w:rFonts w:ascii="Times New Roman" w:hAnsi="Times New Roman"/>
+              </w:rPr>
               <w:t>28</w:t>
             </w:r>
           </w:p>
@@ -911,28 +1015,38 @@
       <w:tr>
         <w:tc>
           <w:tcPr>
-            <w:tcW w:type="dxa" w:w="1152"/>
+            <w:tcW w:type="dxa" w:w="2880"/>
           </w:tcPr>
           <w:p>
-            <w:r/>
+            <w:r>
+              <w:rPr>
+                <w:rFonts w:ascii="Times New Roman" w:hAnsi="Times New Roman"/>
+              </w:rPr>
+            </w:r>
           </w:p>
         </w:tc>
         <w:tc>
           <w:tcPr>
-            <w:tcW w:type="dxa" w:w="6480"/>
+            <w:tcW w:type="dxa" w:w="2880"/>
           </w:tcPr>
           <w:p>
             <w:r>
+              <w:rPr>
+                <w:rFonts w:ascii="Times New Roman" w:hAnsi="Times New Roman"/>
+              </w:rPr>
               <w:t>6.2 SCOPE AND FUTURE MODIFICATION</w:t>
             </w:r>
           </w:p>
         </w:tc>
         <w:tc>
           <w:tcPr>
-            <w:tcW w:type="dxa" w:w="1152"/>
+            <w:tcW w:type="dxa" w:w="2880"/>
           </w:tcPr>
           <w:p>
             <w:r>
+              <w:rPr>
+                <w:rFonts w:ascii="Times New Roman" w:hAnsi="Times New Roman"/>
+              </w:rPr>
               <w:t>29</w:t>
             </w:r>
           </w:p>
@@ -941,11 +1055,12 @@
       <w:tr>
         <w:tc>
           <w:tcPr>
-            <w:tcW w:type="dxa" w:w="1152"/>
+            <w:tcW w:type="dxa" w:w="2880"/>
           </w:tcPr>
           <w:p>
             <w:r>
               <w:rPr>
+                <w:rFonts w:ascii="Times New Roman" w:hAnsi="Times New Roman"/>
                 <w:b/>
               </w:rPr>
               <w:t>7</w:t>
@@ -954,11 +1069,12 @@
         </w:tc>
         <w:tc>
           <w:tcPr>
-            <w:tcW w:type="dxa" w:w="6480"/>
+            <w:tcW w:type="dxa" w:w="2880"/>
           </w:tcPr>
           <w:p>
             <w:r>
               <w:rPr>
+                <w:rFonts w:ascii="Times New Roman" w:hAnsi="Times New Roman"/>
                 <w:b/>
               </w:rPr>
               <w:t>REFERENCES / BIBLIOGRAPHY</w:t>
@@ -967,11 +1083,12 @@
         </w:tc>
         <w:tc>
           <w:tcPr>
-            <w:tcW w:type="dxa" w:w="1152"/>
+            <w:tcW w:type="dxa" w:w="2880"/>
           </w:tcPr>
           <w:p>
             <w:r>
               <w:rPr>
+                <w:rFonts w:ascii="Times New Roman" w:hAnsi="Times New Roman"/>
                 <w:b/>
               </w:rPr>
               <w:t>30</w:t>
@@ -985,21 +1102,31 @@
         <w:br w:type="page"/>
       </w:r>
     </w:p>
+    <w:p/>
+    <w:p/>
+    <w:p/>
+    <w:p/>
+    <w:p/>
+    <w:p/>
+    <w:p/>
+    <w:p/>
+    <w:p/>
+    <w:p/>
+    <w:p/>
+    <w:p/>
     <w:p>
       <w:pPr>
         <w:pStyle w:val="Heading1"/>
         <w:jc w:val="center"/>
       </w:pPr>
       <w:r>
-        <w:t>ABSTRACT</w:t>
-      </w:r>
-    </w:p>
-    <w:p>
-      <w:pPr>
-        <w:jc w:val="both"/>
-      </w:pPr>
-      <w:r>
-        <w:t>The modern job market has become increasingly competitive, with employers relying heavily on Applicant Tracking Systems (ATS). AI Resume Studio is an advanced cloud-based Resume Maker platform configured with ATS Scoring &amp; AI-Powered features which help candidates generate a professional and short-listed CV.</w:t>
+        <w:rPr>
+          <w:rFonts w:ascii="Times New Roman" w:hAnsi="Times New Roman"/>
+          <w:b/>
+          <w:color w:val="000000"/>
+          <w:sz w:val="48"/>
+        </w:rPr>
+        <w:t>BRIEF REVIEW OF THE PROJECT</w:t>
       </w:r>
     </w:p>
     <w:p>
@@ -1009,26 +1136,205 @@
     </w:p>
     <w:p>
       <w:pPr>
+        <w:pStyle w:val="Heading2"/>
+        <w:jc w:val="left"/>
+      </w:pPr>
+      <w:r>
+        <w:rPr>
+          <w:rFonts w:ascii="Times New Roman" w:hAnsi="Times New Roman"/>
+          <w:b/>
+          <w:color w:val="000000"/>
+          <w:u w:val="single"/>
+        </w:rPr>
+        <w:t>1.1 TITLE</w:t>
+      </w:r>
+    </w:p>
+    <w:p>
+      <w:pPr>
+        <w:jc w:val="both"/>
+      </w:pPr>
+      <w:r>
+        <w:rPr>
+          <w:rFonts w:ascii="Times New Roman" w:hAnsi="Times New Roman"/>
+          <w:sz w:val="24"/>
+        </w:rPr>
+        <w:t>AI Resume Studio — Resume Maker with ATS Scoring &amp; AI-Powered Features</w:t>
+      </w:r>
+    </w:p>
+    <w:p>
+      <w:pPr>
+        <w:pStyle w:val="Heading2"/>
+        <w:jc w:val="left"/>
+      </w:pPr>
+      <w:r>
+        <w:rPr>
+          <w:rFonts w:ascii="Times New Roman" w:hAnsi="Times New Roman"/>
+          <w:b/>
+          <w:color w:val="000000"/>
+          <w:u w:val="single"/>
+        </w:rPr>
+        <w:t>1.2 INTRODUCTION / OBJECTIVE</w:t>
+      </w:r>
+    </w:p>
+    <w:p>
+      <w:pPr>
+        <w:jc w:val="both"/>
+      </w:pPr>
+      <w:r>
+        <w:rPr>
+          <w:rFonts w:ascii="Times New Roman" w:hAnsi="Times New Roman"/>
+          <w:sz w:val="24"/>
+        </w:rPr>
+        <w:t>The online resume building ecosystem is a very popular platform for job seekers. Many companies are now enforcing strict Applicant Tracking System (ATS) parsing systems. Our AI Resume Studio provides facilities like smart skill and language proficiency detection, auto ATS scores, intelligent summary generation, and interactive resume dashboards. It acts similarly to modern portfolio systems but has advanced AI features making recruitment easier.</w:t>
+      </w:r>
+    </w:p>
+    <w:p>
+      <w:pPr>
+        <w:pStyle w:val="Heading2"/>
+        <w:jc w:val="left"/>
+      </w:pPr>
+      <w:r>
+        <w:rPr>
+          <w:rFonts w:ascii="Times New Roman" w:hAnsi="Times New Roman"/>
+          <w:b/>
+          <w:color w:val="000000"/>
+          <w:u w:val="single"/>
+        </w:rPr>
+        <w:t>1.3 PRELIMINARY INVESTIGATION</w:t>
+      </w:r>
+    </w:p>
+    <w:p>
+      <w:pPr>
+        <w:jc w:val="both"/>
+      </w:pPr>
+      <w:r>
+        <w:rPr>
+          <w:rFonts w:ascii="Times New Roman" w:hAnsi="Times New Roman"/>
+          <w:sz w:val="24"/>
+        </w:rPr>
+        <w:t>A preliminary investigation of resume builders typically involves examining various aspects related to ATS functionalities. Here is a breakdown:</w:t>
+      </w:r>
+    </w:p>
+    <w:p>
+      <w:pPr>
+        <w:jc w:val="both"/>
+      </w:pPr>
+      <w:r>
+        <w:rPr>
+          <w:rFonts w:ascii="Times New Roman" w:hAnsi="Times New Roman"/>
+          <w:sz w:val="24"/>
+        </w:rPr>
+        <w:t>1. Technology Infrastructure: Assess the technological requirements, including React interface, APIs, PDF generation limitations.</w:t>
+      </w:r>
+    </w:p>
+    <w:p>
+      <w:pPr>
+        <w:jc w:val="both"/>
+      </w:pPr>
+      <w:r>
+        <w:rPr>
+          <w:rFonts w:ascii="Times New Roman" w:hAnsi="Times New Roman"/>
+          <w:sz w:val="24"/>
+        </w:rPr>
+        <w:t>2. Assessment and Feedback: Evaluate the mechanisms of real-time ATS feedback systems across formats.</w:t>
+      </w:r>
+    </w:p>
+    <w:p>
+      <w:pPr>
+        <w:jc w:val="both"/>
+      </w:pPr>
+      <w:r>
+        <w:rPr>
+          <w:rFonts w:ascii="Times New Roman" w:hAnsi="Times New Roman"/>
+          <w:sz w:val="24"/>
+        </w:rPr>
+        <w:t>3. Data Privacy and Security: Investigate measures ensuring user PDF data privacy and secure authentication via Supabase.</w:t>
+      </w:r>
+    </w:p>
+    <w:p>
+      <w:pPr>
+        <w:pStyle w:val="Heading2"/>
+        <w:jc w:val="left"/>
+      </w:pPr>
+      <w:r>
+        <w:rPr>
+          <w:rFonts w:ascii="Times New Roman" w:hAnsi="Times New Roman"/>
+          <w:b/>
+          <w:color w:val="000000"/>
+          <w:u w:val="single"/>
+        </w:rPr>
+        <w:t>1.4 FLAWS IN PRESENT SYSTEM</w:t>
+      </w:r>
+    </w:p>
+    <w:p>
+      <w:pPr>
+        <w:jc w:val="both"/>
+      </w:pPr>
+      <w:r>
+        <w:rPr>
+          <w:rFonts w:ascii="Times New Roman" w:hAnsi="Times New Roman"/>
+          <w:sz w:val="24"/>
+        </w:rPr>
+        <w:t>Current generic platforms lack structured AI suggestions and native ATS grading metrics, meaning users miss out on keyword insertions blindly.</w:t>
+      </w:r>
+    </w:p>
+    <w:p>
+      <w:pPr>
+        <w:pStyle w:val="Heading2"/>
+        <w:jc w:val="left"/>
+      </w:pPr>
+      <w:r>
+        <w:rPr>
+          <w:rFonts w:ascii="Times New Roman" w:hAnsi="Times New Roman"/>
+          <w:b/>
+          <w:color w:val="000000"/>
+          <w:u w:val="single"/>
+        </w:rPr>
+        <w:t>1.5 NEED OF NEW SYSTEM</w:t>
+      </w:r>
+    </w:p>
+    <w:p>
+      <w:pPr>
+        <w:jc w:val="both"/>
+      </w:pPr>
+      <w:r>
+        <w:rPr>
+          <w:rFonts w:ascii="Times New Roman" w:hAnsi="Times New Roman"/>
+          <w:sz w:val="24"/>
+        </w:rPr>
+        <w:t>Our AI Resume Studio online system has significant facilities that a user or recruiter can utilize. The system intelligently detects job description overlaps and calculates an exact ATS fit percentage.</w:t>
+      </w:r>
+    </w:p>
+    <w:p>
+      <w:r>
+        <w:br w:type="page"/>
+      </w:r>
+    </w:p>
+    <w:p/>
+    <w:p/>
+    <w:p/>
+    <w:p/>
+    <w:p/>
+    <w:p/>
+    <w:p/>
+    <w:p/>
+    <w:p/>
+    <w:p/>
+    <w:p/>
+    <w:p/>
+    <w:p>
+      <w:pPr>
         <w:pStyle w:val="Heading1"/>
         <w:jc w:val="center"/>
       </w:pPr>
       <w:r>
-        <w:t>LIST OF FIGURES</w:t>
-      </w:r>
-    </w:p>
-    <w:p>
-      <w:r>
-        <w:t>Figure 1: System Flow Chart</w:t>
-        <w:br/>
-        <w:t>Figure 2: Data Flow Diagram</w:t>
-        <w:br/>
-        <w:t>Figure 3: Login Input Screen</w:t>
-        <w:br/>
-        <w:t>Figure 4: Dashboard Output Screen</w:t>
-        <w:br/>
-        <w:t>Figure 5: Resume Builder Interface</w:t>
-        <w:br/>
-        <w:t>Figure 6: Templates Selection</w:t>
+        <w:rPr>
+          <w:rFonts w:ascii="Times New Roman" w:hAnsi="Times New Roman"/>
+          <w:b/>
+          <w:color w:val="000000"/>
+          <w:sz w:val="48"/>
+        </w:rPr>
+        <w:t>DETAILED SYSTEM DESIGN</w:t>
       </w:r>
     </w:p>
     <w:p>
@@ -1038,20 +1344,203 @@
     </w:p>
     <w:p>
       <w:pPr>
-        <w:pStyle w:val="Heading1"/>
-        <w:jc w:val="center"/>
+        <w:pStyle w:val="Heading2"/>
+        <w:jc w:val="left"/>
       </w:pPr>
       <w:r>
-        <w:t>LIST OF TABLES</w:t>
+        <w:rPr>
+          <w:rFonts w:ascii="Times New Roman" w:hAnsi="Times New Roman"/>
+          <w:b/>
+          <w:color w:val="000000"/>
+          <w:u w:val="single"/>
+        </w:rPr>
+        <w:t>2.1 SYSTEM FLOW CHART</w:t>
+      </w:r>
+    </w:p>
+    <w:p>
+      <w:pPr>
+        <w:pStyle w:val="ListBullet"/>
+      </w:pPr>
+      <w:r>
+        <w:rPr>
+          <w:rFonts w:ascii="Times New Roman" w:hAnsi="Times New Roman"/>
+          <w:sz w:val="24"/>
+        </w:rPr>
+        <w:t>System Flow Diagram for Admin:</w:t>
       </w:r>
     </w:p>
     <w:p>
       <w:r>
-        <w:t>Table 1: Data Dictionary - Users</w:t>
-        <w:br/>
-        <w:t>Table 2: Data Dictionary - Resumes</w:t>
-        <w:br/>
-        <w:t>Table 3: Hardware / Software Requirements</w:t>
+        <w:drawing>
+          <wp:inline xmlns:a="http://schemas.openxmlformats.org/drawingml/2006/main" xmlns:pic="http://schemas.openxmlformats.org/drawingml/2006/picture">
+            <wp:extent cx="4114800" cy="10987664"/>
+            <wp:docPr id="1" name="Picture 1"/>
+            <wp:cNvGraphicFramePr>
+              <a:graphicFrameLocks noChangeAspect="1"/>
+            </wp:cNvGraphicFramePr>
+            <a:graphic>
+              <a:graphicData uri="http://schemas.openxmlformats.org/drawingml/2006/picture">
+                <pic:pic>
+                  <pic:nvPicPr>
+                    <pic:cNvPr id="0" name="system_flow_admin.png"/>
+                    <pic:cNvPicPr/>
+                  </pic:nvPicPr>
+                  <pic:blipFill>
+                    <a:blip r:embed="rId11"/>
+                    <a:stretch>
+                      <a:fillRect/>
+                    </a:stretch>
+                  </pic:blipFill>
+                  <pic:spPr>
+                    <a:xfrm>
+                      <a:off x="0" y="0"/>
+                      <a:ext cx="4114800" cy="10987664"/>
+                    </a:xfrm>
+                    <a:prstGeom prst="rect"/>
+                  </pic:spPr>
+                </pic:pic>
+              </a:graphicData>
+            </a:graphic>
+          </wp:inline>
+        </w:drawing>
+      </w:r>
+    </w:p>
+    <w:p>
+      <w:pPr>
+        <w:pStyle w:val="ListBullet"/>
+      </w:pPr>
+      <w:r>
+        <w:rPr>
+          <w:rFonts w:ascii="Times New Roman" w:hAnsi="Times New Roman"/>
+          <w:sz w:val="24"/>
+        </w:rPr>
+        <w:t>System Flow Diagram for User:</w:t>
+      </w:r>
+    </w:p>
+    <w:p>
+      <w:r>
+        <w:drawing>
+          <wp:inline xmlns:a="http://schemas.openxmlformats.org/drawingml/2006/main" xmlns:pic="http://schemas.openxmlformats.org/drawingml/2006/picture">
+            <wp:extent cx="3200400" cy="11349733"/>
+            <wp:docPr id="2" name="Picture 2"/>
+            <wp:cNvGraphicFramePr>
+              <a:graphicFrameLocks noChangeAspect="1"/>
+            </wp:cNvGraphicFramePr>
+            <a:graphic>
+              <a:graphicData uri="http://schemas.openxmlformats.org/drawingml/2006/picture">
+                <pic:pic>
+                  <pic:nvPicPr>
+                    <pic:cNvPr id="0" name="system_flow_user.png"/>
+                    <pic:cNvPicPr/>
+                  </pic:nvPicPr>
+                  <pic:blipFill>
+                    <a:blip r:embed="rId12"/>
+                    <a:stretch>
+                      <a:fillRect/>
+                    </a:stretch>
+                  </pic:blipFill>
+                  <pic:spPr>
+                    <a:xfrm>
+                      <a:off x="0" y="0"/>
+                      <a:ext cx="3200400" cy="11349733"/>
+                    </a:xfrm>
+                    <a:prstGeom prst="rect"/>
+                  </pic:spPr>
+                </pic:pic>
+              </a:graphicData>
+            </a:graphic>
+          </wp:inline>
+        </w:drawing>
+      </w:r>
+    </w:p>
+    <w:p>
+      <w:pPr>
+        <w:pStyle w:val="Heading2"/>
+        <w:jc w:val="left"/>
+      </w:pPr>
+      <w:r>
+        <w:rPr>
+          <w:rFonts w:ascii="Times New Roman" w:hAnsi="Times New Roman"/>
+          <w:b/>
+          <w:color w:val="000000"/>
+          <w:u w:val="single"/>
+        </w:rPr>
+        <w:t>2.2 DETAILS OF LOGIC DEVELOPED</w:t>
+      </w:r>
+    </w:p>
+    <w:p>
+      <w:pPr>
+        <w:jc w:val="both"/>
+      </w:pPr>
+      <w:r>
+        <w:rPr>
+          <w:rFonts w:ascii="Times New Roman" w:hAnsi="Times New Roman"/>
+          <w:sz w:val="24"/>
+        </w:rPr>
+        <w:t>The logic was developed using the React functional components state. The AI logic was built connecting an external API (Claude Opus) and processing chunks of texts into exact structural points.</w:t>
+      </w:r>
+    </w:p>
+    <w:p>
+      <w:pPr>
+        <w:pStyle w:val="Heading2"/>
+        <w:jc w:val="left"/>
+      </w:pPr>
+      <w:r>
+        <w:rPr>
+          <w:rFonts w:ascii="Times New Roman" w:hAnsi="Times New Roman"/>
+          <w:b/>
+          <w:color w:val="000000"/>
+          <w:u w:val="single"/>
+        </w:rPr>
+        <w:t>2.3 STRUCTURE DIAGRAM OF EACH MODULE</w:t>
+      </w:r>
+    </w:p>
+    <w:p>
+      <w:pPr>
+        <w:pStyle w:val="ListBullet"/>
+      </w:pPr>
+      <w:r>
+        <w:rPr>
+          <w:rFonts w:ascii="Times New Roman" w:hAnsi="Times New Roman"/>
+          <w:sz w:val="24"/>
+        </w:rPr>
+        <w:t>Activity diagram for Admin:</w:t>
+      </w:r>
+    </w:p>
+    <w:p>
+      <w:r>
+        <w:drawing>
+          <wp:inline xmlns:a="http://schemas.openxmlformats.org/drawingml/2006/main" xmlns:pic="http://schemas.openxmlformats.org/drawingml/2006/picture">
+            <wp:extent cx="4572000" cy="3740990"/>
+            <wp:docPr id="3" name="Picture 3"/>
+            <wp:cNvGraphicFramePr>
+              <a:graphicFrameLocks noChangeAspect="1"/>
+            </wp:cNvGraphicFramePr>
+            <a:graphic>
+              <a:graphicData uri="http://schemas.openxmlformats.org/drawingml/2006/picture">
+                <pic:pic>
+                  <pic:nvPicPr>
+                    <pic:cNvPr id="0" name="activity_admin.png"/>
+                    <pic:cNvPicPr/>
+                  </pic:nvPicPr>
+                  <pic:blipFill>
+                    <a:blip r:embed="rId13"/>
+                    <a:stretch>
+                      <a:fillRect/>
+                    </a:stretch>
+                  </pic:blipFill>
+                  <pic:spPr>
+                    <a:xfrm>
+                      <a:off x="0" y="0"/>
+                      <a:ext cx="4572000" cy="3740990"/>
+                    </a:xfrm>
+                    <a:prstGeom prst="rect"/>
+                  </pic:spPr>
+                </pic:pic>
+              </a:graphicData>
+            </a:graphic>
+          </wp:inline>
+        </w:drawing>
       </w:r>
     </w:p>
     <w:p>
@@ -1061,92 +1550,146 @@
     </w:p>
     <w:p>
       <w:pPr>
-        <w:pStyle w:val="Heading1"/>
+        <w:pStyle w:val="ListBullet"/>
       </w:pPr>
       <w:r>
-        <w:t>1. BRIEF REVIEW OF THE PROJECT</w:t>
+        <w:rPr>
+          <w:rFonts w:ascii="Times New Roman" w:hAnsi="Times New Roman"/>
+          <w:sz w:val="24"/>
+        </w:rPr>
+        <w:t>Activity diagram for User:</w:t>
+      </w:r>
+    </w:p>
+    <w:p>
+      <w:r>
+        <w:drawing>
+          <wp:inline xmlns:a="http://schemas.openxmlformats.org/drawingml/2006/main" xmlns:pic="http://schemas.openxmlformats.org/drawingml/2006/picture">
+            <wp:extent cx="4572000" cy="6258812"/>
+            <wp:docPr id="4" name="Picture 4"/>
+            <wp:cNvGraphicFramePr>
+              <a:graphicFrameLocks noChangeAspect="1"/>
+            </wp:cNvGraphicFramePr>
+            <a:graphic>
+              <a:graphicData uri="http://schemas.openxmlformats.org/drawingml/2006/picture">
+                <pic:pic>
+                  <pic:nvPicPr>
+                    <pic:cNvPr id="0" name="activity_user.png"/>
+                    <pic:cNvPicPr/>
+                  </pic:nvPicPr>
+                  <pic:blipFill>
+                    <a:blip r:embed="rId14"/>
+                    <a:stretch>
+                      <a:fillRect/>
+                    </a:stretch>
+                  </pic:blipFill>
+                  <pic:spPr>
+                    <a:xfrm>
+                      <a:off x="0" y="0"/>
+                      <a:ext cx="4572000" cy="6258812"/>
+                    </a:xfrm>
+                    <a:prstGeom prst="rect"/>
+                  </pic:spPr>
+                </pic:pic>
+              </a:graphicData>
+            </a:graphic>
+          </wp:inline>
+        </w:drawing>
       </w:r>
     </w:p>
     <w:p>
       <w:pPr>
-        <w:pStyle w:val="Heading2"/>
+        <w:pStyle w:val="ListBullet"/>
       </w:pPr>
       <w:r>
-        <w:t>1.1 TITLE</w:t>
+        <w:rPr>
+          <w:rFonts w:ascii="Times New Roman" w:hAnsi="Times New Roman"/>
+          <w:sz w:val="24"/>
+        </w:rPr>
+        <w:t>State Diagram of Admin:</w:t>
       </w:r>
     </w:p>
     <w:p>
       <w:r>
-        <w:t>AI Resume Studio — Resume Maker with ATS Scoring &amp; AI-Powered Features</w:t>
+        <w:drawing>
+          <wp:inline xmlns:a="http://schemas.openxmlformats.org/drawingml/2006/main" xmlns:pic="http://schemas.openxmlformats.org/drawingml/2006/picture">
+            <wp:extent cx="3657600" cy="3086911"/>
+            <wp:docPr id="5" name="Picture 5"/>
+            <wp:cNvGraphicFramePr>
+              <a:graphicFrameLocks noChangeAspect="1"/>
+            </wp:cNvGraphicFramePr>
+            <a:graphic>
+              <a:graphicData uri="http://schemas.openxmlformats.org/drawingml/2006/picture">
+                <pic:pic>
+                  <pic:nvPicPr>
+                    <pic:cNvPr id="0" name="state_admin.png"/>
+                    <pic:cNvPicPr/>
+                  </pic:nvPicPr>
+                  <pic:blipFill>
+                    <a:blip r:embed="rId15"/>
+                    <a:stretch>
+                      <a:fillRect/>
+                    </a:stretch>
+                  </pic:blipFill>
+                  <pic:spPr>
+                    <a:xfrm>
+                      <a:off x="0" y="0"/>
+                      <a:ext cx="3657600" cy="3086911"/>
+                    </a:xfrm>
+                    <a:prstGeom prst="rect"/>
+                  </pic:spPr>
+                </pic:pic>
+              </a:graphicData>
+            </a:graphic>
+          </wp:inline>
+        </w:drawing>
       </w:r>
     </w:p>
     <w:p>
       <w:pPr>
-        <w:pStyle w:val="Heading2"/>
+        <w:pStyle w:val="ListBullet"/>
       </w:pPr>
       <w:r>
-        <w:t>1.2 INTRODUCTION / OBJECTIVE</w:t>
-      </w:r>
-    </w:p>
-    <w:p>
-      <w:pPr>
-        <w:jc w:val="both"/>
-      </w:pPr>
-      <w:r>
-        <w:t>The main objective of AI Resume Studio is to provide job seekers with a powerful AI-driven platform to build professional, ATS-optimized resumes. It provides real-time ATS scoring, smart AI suggestions for bullet points, and dynamic generation of professional summaries.</w:t>
-      </w:r>
-    </w:p>
-    <w:p>
-      <w:pPr>
-        <w:pStyle w:val="Heading2"/>
-      </w:pPr>
-      <w:r>
-        <w:t>1.3 PRELIMINARY INVESTIGATION</w:t>
-      </w:r>
-    </w:p>
-    <w:p>
-      <w:pPr>
-        <w:jc w:val="both"/>
-      </w:pPr>
-      <w:r>
-        <w:t>Preliminary investigation revealed that over 75% of resumes are rejected by ATS software blindly because of poor formatting, lack of keywords, or unstructured designs. Job seekers face high rejection rates despite being qualified.</w:t>
-      </w:r>
-    </w:p>
-    <w:p>
-      <w:pPr>
-        <w:pStyle w:val="Heading2"/>
-      </w:pPr>
-      <w:r>
-        <w:t>1.4 FLAWS IN PRESENT SYSTEM</w:t>
+        <w:rPr>
+          <w:rFonts w:ascii="Times New Roman" w:hAnsi="Times New Roman"/>
+          <w:sz w:val="24"/>
+        </w:rPr>
+        <w:t>State Diagram of User:</w:t>
       </w:r>
     </w:p>
     <w:p>
       <w:r>
-        <w:t>• Traditional generic tools lack ATS-friendly formatting.</w:t>
-        <w:br/>
-        <w:t>• Existing systems do not offer detailed analytics or pinpoint exact keyword gaps.</w:t>
-        <w:br/>
-        <w:t>• No contextual AI assistance that adapts to the specific job descriptions.</w:t>
-      </w:r>
-    </w:p>
-    <w:p>
-      <w:pPr>
-        <w:pStyle w:val="Heading2"/>
-      </w:pPr>
-      <w:r>
-        <w:t>1.5 NEED OF NEW SYSTEM</w:t>
-      </w:r>
-    </w:p>
-    <w:p>
-      <w:pPr>
-        <w:jc w:val="both"/>
-      </w:pPr>
-      <w:r>
-        <w:t>• To bridge the gap between job applicant qualifications and recruiter expectations.</w:t>
-        <w:br/>
-        <w:t>• To automate resume formatting so users focus purely on content.</w:t>
-        <w:br/>
-        <w:t>• To use LLMs effectively in evaluating and refining professional vocabulary.</w:t>
+        <w:drawing>
+          <wp:inline xmlns:a="http://schemas.openxmlformats.org/drawingml/2006/main" xmlns:pic="http://schemas.openxmlformats.org/drawingml/2006/picture">
+            <wp:extent cx="3657600" cy="7134578"/>
+            <wp:docPr id="6" name="Picture 6"/>
+            <wp:cNvGraphicFramePr>
+              <a:graphicFrameLocks noChangeAspect="1"/>
+            </wp:cNvGraphicFramePr>
+            <a:graphic>
+              <a:graphicData uri="http://schemas.openxmlformats.org/drawingml/2006/picture">
+                <pic:pic>
+                  <pic:nvPicPr>
+                    <pic:cNvPr id="0" name="state_user.png"/>
+                    <pic:cNvPicPr/>
+                  </pic:nvPicPr>
+                  <pic:blipFill>
+                    <a:blip r:embed="rId16"/>
+                    <a:stretch>
+                      <a:fillRect/>
+                    </a:stretch>
+                  </pic:blipFill>
+                  <pic:spPr>
+                    <a:xfrm>
+                      <a:off x="0" y="0"/>
+                      <a:ext cx="3657600" cy="7134578"/>
+                    </a:xfrm>
+                    <a:prstGeom prst="rect"/>
+                  </pic:spPr>
+                </pic:pic>
+              </a:graphicData>
+            </a:graphic>
+          </wp:inline>
+        </w:drawing>
       </w:r>
     </w:p>
     <w:p>
@@ -1156,36 +1699,17 @@
     </w:p>
     <w:p>
       <w:pPr>
-        <w:pStyle w:val="Heading1"/>
+        <w:pStyle w:val="Heading2"/>
+        <w:jc w:val="left"/>
       </w:pPr>
       <w:r>
-        <w:t>2. DETAILED SYSTEM DESIGN</w:t>
-      </w:r>
-    </w:p>
-    <w:p>
-      <w:pPr>
-        <w:pStyle w:val="Heading2"/>
-      </w:pPr>
-      <w:r>
-        <w:t>2.1 SYSTEM FLOW CHART</w:t>
-      </w:r>
-    </w:p>
-    <w:p>
-      <w:r>
-        <w:t>User Authentication -&gt; Dashboard -&gt; Create/Edit Resume -&gt; AI Optimization -&gt; ATS Score Check -&gt; Download PDF.</w:t>
-      </w:r>
-    </w:p>
-    <w:p>
-      <w:r>
-        <w:t>[Placeholder for System Flow Chart Diagram]</w:t>
-      </w:r>
-    </w:p>
-    <w:p>
-      <w:pPr>
-        <w:pStyle w:val="Heading2"/>
-      </w:pPr>
-      <w:r>
-        <w:t>2.2 DETAILS OF LOGIC DEVELOPED</w:t>
+        <w:rPr>
+          <w:rFonts w:ascii="Times New Roman" w:hAnsi="Times New Roman"/>
+          <w:b/>
+          <w:color w:val="000000"/>
+          <w:u w:val="single"/>
+        </w:rPr>
+        <w:t>2.4 DATA DICTIONARY</w:t>
       </w:r>
     </w:p>
     <w:p>
@@ -1193,67 +1717,70 @@
         <w:jc w:val="both"/>
       </w:pPr>
       <w:r>
-        <w:t>The core logic entails fetching user section (Experience, Education, Skills) and running it through a sophisticated scoring algorithm. The API queries OpenRouter/Claude 3 Opus for intelligent recommendations based on TF-IDF logic of the provided Job descriptions.</w:t>
+        <w:rPr>
+          <w:rFonts w:ascii="Times New Roman" w:hAnsi="Times New Roman"/>
+          <w:sz w:val="24"/>
+        </w:rPr>
+        <w:t>Database: Supabase PostgreSQL. Tables include 'resumes', 'profiles', etc.</w:t>
       </w:r>
     </w:p>
     <w:p>
       <w:pPr>
         <w:pStyle w:val="Heading2"/>
+        <w:jc w:val="left"/>
       </w:pPr>
       <w:r>
-        <w:t>2.3 STRUCTURE DIAGRAM OF EACH MODULE</w:t>
+        <w:rPr>
+          <w:rFonts w:ascii="Times New Roman" w:hAnsi="Times New Roman"/>
+          <w:b/>
+          <w:color w:val="000000"/>
+          <w:u w:val="single"/>
+        </w:rPr>
+        <w:t>2.5 DATA FLOW DIAGRAMS</w:t>
+      </w:r>
+    </w:p>
+    <w:p>
+      <w:pPr>
+        <w:jc w:val="both"/>
+      </w:pPr>
+      <w:r>
+        <w:rPr>
+          <w:rFonts w:ascii="Times New Roman" w:hAnsi="Times New Roman"/>
+          <w:sz w:val="24"/>
+        </w:rPr>
+        <w:t>See flow diagrams indicated previously.</w:t>
       </w:r>
     </w:p>
     <w:p>
       <w:r>
-        <w:t>Modules Include:</w:t>
-        <w:br/>
-        <w:t>1. Auth Module</w:t>
-        <w:br/>
-        <w:t>2. Resume CRUD Module</w:t>
-        <w:br/>
-        <w:t xml:space="preserve">3. AI Analysis Module </w:t>
-        <w:br/>
-        <w:t>4. Export/PDF Module</w:t>
-        <w:br/>
-        <w:t>[Placeholder for Structure Diagram]</w:t>
+        <w:br w:type="page"/>
       </w:r>
     </w:p>
+    <w:p/>
+    <w:p/>
+    <w:p/>
+    <w:p/>
+    <w:p/>
+    <w:p/>
+    <w:p/>
+    <w:p/>
+    <w:p/>
+    <w:p/>
+    <w:p/>
+    <w:p/>
     <w:p>
       <w:pPr>
-        <w:pStyle w:val="Heading2"/>
+        <w:pStyle w:val="Heading1"/>
+        <w:jc w:val="center"/>
       </w:pPr>
       <w:r>
-        <w:t>2.4 DATA DICTIONARY</w:t>
-      </w:r>
-    </w:p>
-    <w:p>
-      <w:r>
-        <w:t>Table: Users</w:t>
-        <w:br/>
-        <w:t>Columns: id (UUID), email (VARCHAR), created_at (TIMESTAMP), subscription_tier (VARCHAR).</w:t>
-        <w:br/>
-        <w:br/>
-        <w:t>Table: Resumes</w:t>
-        <w:br/>
-        <w:t>Columns: id (UUID), user_id (UUID), content (JSONB), ats_score (INTEGER).</w:t>
-      </w:r>
-    </w:p>
-    <w:p>
-      <w:pPr>
-        <w:pStyle w:val="Heading2"/>
-      </w:pPr>
-      <w:r>
-        <w:t>2.5 DATA FLOW DIAGRAMS</w:t>
-      </w:r>
-    </w:p>
-    <w:p>
-      <w:r>
-        <w:t>DFD Level 0: User -&gt; System -&gt; Job Ready Output.</w:t>
-        <w:br/>
-        <w:t>DFD Level 1: Expand into Sub-processes like Validation, Formatting, and Download.</w:t>
-        <w:br/>
-        <w:t>[Placeholder for DFD Diagram]</w:t>
+        <w:rPr>
+          <w:rFonts w:ascii="Times New Roman" w:hAnsi="Times New Roman"/>
+          <w:b/>
+          <w:color w:val="000000"/>
+          <w:sz w:val="48"/>
+        </w:rPr>
+        <w:t>SOFTWARE/ HARDWARE DETAILS</w:t>
       </w:r>
     </w:p>
     <w:p>
@@ -1263,51 +1790,88 @@
     </w:p>
     <w:p>
       <w:pPr>
-        <w:pStyle w:val="Heading1"/>
+        <w:pStyle w:val="Heading2"/>
+        <w:jc w:val="left"/>
       </w:pPr>
       <w:r>
-        <w:t>3. SOFTWARE/ HARDWARE DETAILS</w:t>
+        <w:rPr>
+          <w:rFonts w:ascii="Times New Roman" w:hAnsi="Times New Roman"/>
+          <w:b/>
+          <w:color w:val="000000"/>
+          <w:u w:val="single"/>
+        </w:rPr>
+        <w:t>3.1 CHOICE OF A LANGUAGE USED</w:t>
+      </w:r>
+    </w:p>
+    <w:p>
+      <w:pPr>
+        <w:jc w:val="both"/>
+      </w:pPr>
+      <w:r>
+        <w:rPr>
+          <w:rFonts w:ascii="Times New Roman" w:hAnsi="Times New Roman"/>
+          <w:sz w:val="24"/>
+        </w:rPr>
+        <w:t>TypeScript, React, Node.js, Python for scripting.</w:t>
       </w:r>
     </w:p>
     <w:p>
       <w:pPr>
         <w:pStyle w:val="Heading2"/>
+        <w:jc w:val="left"/>
       </w:pPr>
       <w:r>
-        <w:t>3.1 CHOICE OF A LANGUAGE USED</w:t>
+        <w:rPr>
+          <w:rFonts w:ascii="Times New Roman" w:hAnsi="Times New Roman"/>
+          <w:b/>
+          <w:color w:val="000000"/>
+          <w:u w:val="single"/>
+        </w:rPr>
+        <w:t>3.2 HARDWARE/ SOFTWARE SPECIFICATION</w:t>
+      </w:r>
+    </w:p>
+    <w:p>
+      <w:pPr>
+        <w:jc w:val="both"/>
+      </w:pPr>
+      <w:r>
+        <w:rPr>
+          <w:rFonts w:ascii="Times New Roman" w:hAnsi="Times New Roman"/>
+          <w:sz w:val="24"/>
+        </w:rPr>
+        <w:t>Any Web Browser, Minimum 4GB Ram system.</w:t>
       </w:r>
     </w:p>
     <w:p>
       <w:r>
-        <w:t>• Frontend: HTML5, CSS3/Tailwind, React 18, TypeScript.</w:t>
-        <w:br/>
-        <w:t>• Backend Logic: Supabase Edge Functions (Deno/TypeScript), Node.js.</w:t>
-        <w:br/>
-        <w:t>• Database: PostgreSQL (via Supabase).</w:t>
+        <w:br w:type="page"/>
       </w:r>
     </w:p>
+    <w:p/>
+    <w:p/>
+    <w:p/>
+    <w:p/>
+    <w:p/>
+    <w:p/>
+    <w:p/>
+    <w:p/>
+    <w:p/>
+    <w:p/>
+    <w:p/>
+    <w:p/>
     <w:p>
       <w:pPr>
-        <w:pStyle w:val="Heading2"/>
+        <w:pStyle w:val="Heading1"/>
+        <w:jc w:val="center"/>
       </w:pPr>
       <w:r>
-        <w:t>3.2 HARDWARE/ SOFTWARE SPECIFICATION</w:t>
-      </w:r>
-    </w:p>
-    <w:p>
-      <w:r>
-        <w:t>Hardware Requirements (Client Side):</w:t>
-        <w:br/>
-        <w:t>- Any modern operating system (Windows, Linux, macOS).</w:t>
-        <w:br/>
-        <w:t>- 4GB RAM minimum, 2-core processor.</w:t>
-        <w:br/>
-        <w:br/>
-        <w:t>Software Requirements:</w:t>
-        <w:br/>
-        <w:t>- Node.js (v18+)</w:t>
-        <w:br/>
-        <w:t>- Modern Web Browser (Chrome, Edge, Firefox) with JS enabled.</w:t>
+        <w:rPr>
+          <w:rFonts w:ascii="Times New Roman" w:hAnsi="Times New Roman"/>
+          <w:b/>
+          <w:color w:val="000000"/>
+          <w:sz w:val="48"/>
+        </w:rPr>
+        <w:t>SYSTEM DESIGN</w:t>
       </w:r>
     </w:p>
     <w:p>
@@ -1317,30 +1881,128 @@
     </w:p>
     <w:p>
       <w:pPr>
-        <w:pStyle w:val="Heading1"/>
+        <w:pStyle w:val="Heading2"/>
+        <w:jc w:val="left"/>
       </w:pPr>
       <w:r>
-        <w:t>4. SYSTEM DESIGN</w:t>
+        <w:rPr>
+          <w:rFonts w:ascii="Times New Roman" w:hAnsi="Times New Roman"/>
+          <w:b/>
+          <w:color w:val="000000"/>
+          <w:u w:val="single"/>
+        </w:rPr>
+        <w:t>4.1 PROGRAM LISTING</w:t>
+      </w:r>
+    </w:p>
+    <w:p>
+      <w:pPr>
+        <w:jc w:val="both"/>
+      </w:pPr>
+      <w:r>
+        <w:rPr>
+          <w:rFonts w:ascii="Times New Roman" w:hAnsi="Times New Roman"/>
+          <w:sz w:val="24"/>
+        </w:rPr>
+        <w:t>Below is the execution code (src/pages/Index.tsx snippet):</w:t>
+      </w:r>
+    </w:p>
+    <w:p>
+      <w:r>
+        <w:rPr>
+          <w:rFonts w:ascii="Courier New" w:hAnsi="Courier New"/>
+          <w:sz w:val="16"/>
+        </w:rPr>
+        <w:t>import { ModeToggle } from "@/components/theme/ModeToggle";</w:t>
+        <w:br/>
+        <w:t>import { LandingHero } from "@/pages/landing/LandingHero";</w:t>
+        <w:br/>
+        <w:t>import { LandingReportAccordion } from "@/pages/landing/LandingReportAccordion";</w:t>
+        <w:br/>
+        <w:t>import { FloatingAiAssistant } from "@/components/ai/FloatingAiAssistant";</w:t>
+        <w:br/>
+        <w:t>import {</w:t>
+        <w:br/>
+        <w:t xml:space="preserve">  Menu,</w:t>
+        <w:br/>
+        <w:t xml:space="preserve">  X,</w:t>
+        <w:br/>
+        <w:t xml:space="preserve">  FileText,</w:t>
+        <w:br/>
+        <w:t xml:space="preserve">  LayoutDashboard,</w:t>
+        <w:br/>
+        <w:t xml:space="preserve">  Plus,</w:t>
+        <w:br/>
+        <w:t xml:space="preserve">  Shield</w:t>
+        <w:br/>
+        <w:t>} from "lucide-react";</w:t>
+        <w:br/>
+        <w:t>import { useState } from "react";</w:t>
+        <w:br/>
+        <w:br/>
+        <w:t>export default function Index() {</w:t>
+        <w:br/>
+        <w:t xml:space="preserve">  const [mobileMenuOpen, setMobileMenuOpen] = useState(false);</w:t>
+        <w:br/>
+        <w:br/>
+        <w:t xml:space="preserve">  return (</w:t>
+        <w:br/>
+        <w:t xml:space="preserve">    &lt;div className="min-h-screen bg-background"&gt;</w:t>
+        <w:br/>
+        <w:t xml:space="preserve">      &lt;header className="sticky top-0 z-50 border-b border-border/70 bg-background/95 backdrop-blur supports-[backdrop-filter]:bg-background/85"&gt;</w:t>
+        <w:br/>
+        <w:t xml:space="preserve">        &lt;div className="mx-auto flex h-16 w-full max-w-6xl items-center justify-between px-4"&gt;</w:t>
+        <w:br/>
+        <w:t xml:space="preserve">          &lt;a href="/" className="flex items-center gap-2 hover:opacity-80 transition-opacity"&gt;</w:t>
+        <w:br/>
+        <w:t xml:space="preserve">            &lt;img</w:t>
+        <w:br/>
+        <w:t xml:space="preserve">              src="/logo.png"</w:t>
+        <w:br/>
+        <w:t xml:space="preserve">              alt="ResumeGPT Logo"</w:t>
+        <w:br/>
+        <w:t xml:space="preserve">              className="h-12 w-12 object-contain"</w:t>
+        <w:br/>
+        <w:t xml:space="preserve">            /&gt;</w:t>
+        <w:br/>
+        <w:t xml:space="preserve">            &lt;div className="hidden sm:block"&gt;</w:t>
+        <w:br/>
+        <w:t xml:space="preserve">              &lt;p className="text-xl font-bold text-foreground"&gt;ResumeGPT&lt;/p&gt;</w:t>
+        <w:br/>
+        <w:t xml:space="preserve">              &lt;p className="text-xs text-muted-foreground"&gt;Professional Resume Builder&lt;/p&gt;</w:t>
+        <w:br/>
+        <w:t xml:space="preserve">            &lt;/div&gt;</w:t>
+        <w:br/>
+        <w:t xml:space="preserve">          &lt;/a&gt;</w:t>
+        <w:br/>
+        <w:br/>
+        <w:t xml:space="preserve">          &lt;nav className="hidden md:flex items-center gap-3"&gt;</w:t>
+        <w:br/>
+        <w:t xml:space="preserve">            &lt;a</w:t>
+        <w:br/>
+        <w:t xml:space="preserve">              href="/create"</w:t>
+        <w:br/>
+        <w:t xml:space="preserve">              className="flex items-center gap-1 px-4 py-2 rounded-lg font-medium text-primary-foreg</w:t>
+        <w:br/>
+        <w:t>... [Code Truncated]</w:t>
+      </w:r>
+    </w:p>
+    <w:p>
+      <w:r>
+        <w:br w:type="page"/>
       </w:r>
     </w:p>
     <w:p>
       <w:pPr>
         <w:pStyle w:val="Heading2"/>
+        <w:jc w:val="left"/>
       </w:pPr>
       <w:r>
-        <w:t>4.1 PROGRAM LISTING</w:t>
-      </w:r>
-    </w:p>
-    <w:p>
-      <w:r>
-        <w:t>The program consists of modular components in React (`src/components`), hooks for data fetching (`src/hooks/useResume.ts`), pages (`src/pages`), and serverless Edge Functions linked to Supabase PostgreSQL.</w:t>
-      </w:r>
-    </w:p>
-    <w:p>
-      <w:pPr>
-        <w:pStyle w:val="Heading2"/>
-      </w:pPr>
-      <w:r>
+        <w:rPr>
+          <w:rFonts w:ascii="Times New Roman" w:hAnsi="Times New Roman"/>
+          <w:b/>
+          <w:color w:val="000000"/>
+          <w:u w:val="single"/>
+        </w:rPr>
         <w:t>4.2 INPUT SCREENS</w:t>
       </w:r>
     </w:p>
@@ -1349,15 +2011,11 @@
         <w:jc w:val="both"/>
       </w:pPr>
       <w:r>
-        <w:t>The input screens capture user interactions such as logging in, selecting templates, and inputting resume details into the Builder module.</w:t>
-      </w:r>
-    </w:p>
-    <w:p>
-      <w:pPr>
-        <w:jc w:val="center"/>
-      </w:pPr>
-      <w:r>
-        <w:t>Screen: Landing Page (System Entry)</w:t>
+        <w:rPr>
+          <w:rFonts w:ascii="Times New Roman" w:hAnsi="Times New Roman"/>
+          <w:sz w:val="24"/>
+        </w:rPr>
+        <w:t>Platform landing and input interfaces.</w:t>
       </w:r>
     </w:p>
     <w:p>
@@ -1365,7 +2023,7 @@
         <w:drawing>
           <wp:inline xmlns:a="http://schemas.openxmlformats.org/drawingml/2006/main" xmlns:pic="http://schemas.openxmlformats.org/drawingml/2006/picture">
             <wp:extent cx="5486400" cy="3429000"/>
-            <wp:docPr id="1" name="Picture 1"/>
+            <wp:docPr id="7" name="Picture 7"/>
             <wp:cNvGraphicFramePr>
               <a:graphicFrameLocks noChangeAspect="1"/>
             </wp:cNvGraphicFramePr>
@@ -1377,7 +2035,7 @@
                     <pic:cNvPicPr/>
                   </pic:nvPicPr>
                   <pic:blipFill>
-                    <a:blip r:embed="rId9"/>
+                    <a:blip r:embed="rId17"/>
                     <a:stretch>
                       <a:fillRect/>
                     </a:stretch>
@@ -1396,13 +2054,48 @@
         </w:drawing>
       </w:r>
     </w:p>
-    <w:p/>
     <w:p>
       <w:pPr>
         <w:jc w:val="center"/>
       </w:pPr>
       <w:r>
-        <w:t>Screen: Template Selection Screen</w:t>
+        <w:rPr>
+          <w:rFonts w:ascii="Times New Roman" w:hAnsi="Times New Roman"/>
+          <w:sz w:val="24"/>
+        </w:rPr>
+        <w:t>Fig: Landing Page Input</w:t>
+      </w:r>
+    </w:p>
+    <w:p>
+      <w:r>
+        <w:br w:type="page"/>
+      </w:r>
+    </w:p>
+    <w:p>
+      <w:pPr>
+        <w:pStyle w:val="Heading2"/>
+        <w:jc w:val="left"/>
+      </w:pPr>
+      <w:r>
+        <w:rPr>
+          <w:rFonts w:ascii="Times New Roman" w:hAnsi="Times New Roman"/>
+          <w:b/>
+          <w:color w:val="000000"/>
+          <w:u w:val="single"/>
+        </w:rPr>
+        <w:t>4.3 OUTPUT SCREENS / REPORTS</w:t>
+      </w:r>
+    </w:p>
+    <w:p>
+      <w:pPr>
+        <w:jc w:val="both"/>
+      </w:pPr>
+      <w:r>
+        <w:rPr>
+          <w:rFonts w:ascii="Times New Roman" w:hAnsi="Times New Roman"/>
+          <w:sz w:val="24"/>
+        </w:rPr>
+        <w:t>Builder output screens and Dashboard.</w:t>
       </w:r>
     </w:p>
     <w:p>
@@ -1410,7 +2103,7 @@
         <w:drawing>
           <wp:inline xmlns:a="http://schemas.openxmlformats.org/drawingml/2006/main" xmlns:pic="http://schemas.openxmlformats.org/drawingml/2006/picture">
             <wp:extent cx="5486400" cy="3429000"/>
-            <wp:docPr id="2" name="Picture 2"/>
+            <wp:docPr id="8" name="Picture 8"/>
             <wp:cNvGraphicFramePr>
               <a:graphicFrameLocks noChangeAspect="1"/>
             </wp:cNvGraphicFramePr>
@@ -1418,11 +2111,11 @@
               <a:graphicData uri="http://schemas.openxmlformats.org/drawingml/2006/picture">
                 <pic:pic>
                   <pic:nvPicPr>
-                    <pic:cNvPr id="0" name="real_templates.png"/>
+                    <pic:cNvPr id="0" name="real_builder.png"/>
                     <pic:cNvPicPr/>
                   </pic:nvPicPr>
                   <pic:blipFill>
-                    <a:blip r:embed="rId10"/>
+                    <a:blip r:embed="rId18"/>
                     <a:stretch>
                       <a:fillRect/>
                     </a:stretch>
@@ -1441,29 +2134,16 @@
         </w:drawing>
       </w:r>
     </w:p>
-    <w:p/>
-    <w:p>
-      <w:pPr>
-        <w:pStyle w:val="Heading2"/>
-      </w:pPr>
-      <w:r>
-        <w:t>4.3 OUTPUT SCREENS / REPORTS</w:t>
-      </w:r>
-    </w:p>
-    <w:p>
-      <w:pPr>
-        <w:jc w:val="both"/>
-      </w:pPr>
-      <w:r>
-        <w:t>The output screens show the final rendered layout, the analytics dashboard, and the administrative reports.</w:t>
-      </w:r>
-    </w:p>
     <w:p>
       <w:pPr>
         <w:jc w:val="center"/>
       </w:pPr>
       <w:r>
-        <w:t>Screen: Resume Builder Interface (Output View)</w:t>
+        <w:rPr>
+          <w:rFonts w:ascii="Times New Roman" w:hAnsi="Times New Roman"/>
+          <w:sz w:val="24"/>
+        </w:rPr>
+        <w:t>Fig: Builder Generation Page</w:t>
       </w:r>
     </w:p>
     <w:p>
@@ -1471,7 +2151,7 @@
         <w:drawing>
           <wp:inline xmlns:a="http://schemas.openxmlformats.org/drawingml/2006/main" xmlns:pic="http://schemas.openxmlformats.org/drawingml/2006/picture">
             <wp:extent cx="5486400" cy="3429000"/>
-            <wp:docPr id="3" name="Picture 3"/>
+            <wp:docPr id="9" name="Picture 9"/>
             <wp:cNvGraphicFramePr>
               <a:graphicFrameLocks noChangeAspect="1"/>
             </wp:cNvGraphicFramePr>
@@ -1479,11 +2159,11 @@
               <a:graphicData uri="http://schemas.openxmlformats.org/drawingml/2006/picture">
                 <pic:pic>
                   <pic:nvPicPr>
-                    <pic:cNvPr id="0" name="real_builder.png"/>
+                    <pic:cNvPr id="0" name="real_dashboard.png"/>
                     <pic:cNvPicPr/>
                   </pic:nvPicPr>
                   <pic:blipFill>
-                    <a:blip r:embed="rId11"/>
+                    <a:blip r:embed="rId19"/>
                     <a:stretch>
                       <a:fillRect/>
                     </a:stretch>
@@ -1502,130 +2182,48 @@
         </w:drawing>
       </w:r>
     </w:p>
-    <w:p/>
     <w:p>
       <w:pPr>
         <w:jc w:val="center"/>
       </w:pPr>
       <w:r>
-        <w:t>Screen: User Dashboard (Analytics and Management)</w:t>
+        <w:rPr>
+          <w:rFonts w:ascii="Times New Roman" w:hAnsi="Times New Roman"/>
+          <w:sz w:val="24"/>
+        </w:rPr>
+        <w:t>Fig: Dashboard Output Screen</w:t>
       </w:r>
     </w:p>
-    <w:p>
-      <w:r>
-        <w:drawing>
-          <wp:inline xmlns:a="http://schemas.openxmlformats.org/drawingml/2006/main" xmlns:pic="http://schemas.openxmlformats.org/drawingml/2006/picture">
-            <wp:extent cx="5486400" cy="3429000"/>
-            <wp:docPr id="4" name="Picture 4"/>
-            <wp:cNvGraphicFramePr>
-              <a:graphicFrameLocks noChangeAspect="1"/>
-            </wp:cNvGraphicFramePr>
-            <a:graphic>
-              <a:graphicData uri="http://schemas.openxmlformats.org/drawingml/2006/picture">
-                <pic:pic>
-                  <pic:nvPicPr>
-                    <pic:cNvPr id="0" name="real_dashboard.png"/>
-                    <pic:cNvPicPr/>
-                  </pic:nvPicPr>
-                  <pic:blipFill>
-                    <a:blip r:embed="rId12"/>
-                    <a:stretch>
-                      <a:fillRect/>
-                    </a:stretch>
-                  </pic:blipFill>
-                  <pic:spPr>
-                    <a:xfrm>
-                      <a:off x="0" y="0"/>
-                      <a:ext cx="5486400" cy="3429000"/>
-                    </a:xfrm>
-                    <a:prstGeom prst="rect"/>
-                  </pic:spPr>
-                </pic:pic>
-              </a:graphicData>
-            </a:graphic>
-          </wp:inline>
-        </w:drawing>
-      </w:r>
-    </w:p>
-    <w:p/>
-    <w:p>
-      <w:pPr>
-        <w:jc w:val="center"/>
-      </w:pPr>
-      <w:r>
-        <w:t>Screen: Admin Reporting Dashboard</w:t>
-      </w:r>
-    </w:p>
-    <w:p>
-      <w:r>
-        <w:drawing>
-          <wp:inline xmlns:a="http://schemas.openxmlformats.org/drawingml/2006/main" xmlns:pic="http://schemas.openxmlformats.org/drawingml/2006/picture">
-            <wp:extent cx="5486400" cy="3429000"/>
-            <wp:docPr id="5" name="Picture 5"/>
-            <wp:cNvGraphicFramePr>
-              <a:graphicFrameLocks noChangeAspect="1"/>
-            </wp:cNvGraphicFramePr>
-            <a:graphic>
-              <a:graphicData uri="http://schemas.openxmlformats.org/drawingml/2006/picture">
-                <pic:pic>
-                  <pic:nvPicPr>
-                    <pic:cNvPr id="0" name="real_admin.png"/>
-                    <pic:cNvPicPr/>
-                  </pic:nvPicPr>
-                  <pic:blipFill>
-                    <a:blip r:embed="rId13"/>
-                    <a:stretch>
-                      <a:fillRect/>
-                    </a:stretch>
-                  </pic:blipFill>
-                  <pic:spPr>
-                    <a:xfrm>
-                      <a:off x="0" y="0"/>
-                      <a:ext cx="5486400" cy="3429000"/>
-                    </a:xfrm>
-                    <a:prstGeom prst="rect"/>
-                  </pic:spPr>
-                </pic:pic>
-              </a:graphicData>
-            </a:graphic>
-          </wp:inline>
-        </w:drawing>
-      </w:r>
-    </w:p>
-    <w:p/>
     <w:p>
       <w:r>
         <w:br w:type="page"/>
       </w:r>
     </w:p>
+    <w:p/>
+    <w:p/>
+    <w:p/>
+    <w:p/>
+    <w:p/>
+    <w:p/>
+    <w:p/>
+    <w:p/>
+    <w:p/>
+    <w:p/>
+    <w:p/>
+    <w:p/>
     <w:p>
       <w:pPr>
         <w:pStyle w:val="Heading1"/>
+        <w:jc w:val="center"/>
       </w:pPr>
       <w:r>
-        <w:t>5. USER DOCUMENTATION</w:t>
-      </w:r>
-    </w:p>
-    <w:p>
-      <w:pPr>
-        <w:pStyle w:val="Heading2"/>
-      </w:pPr>
-      <w:r>
-        <w:t>5.1 IMPLEMENTATION, PROGRAM EXECUTION &amp; MAINTENANCE</w:t>
-      </w:r>
-    </w:p>
-    <w:p>
-      <w:pPr>
-        <w:jc w:val="both"/>
-      </w:pPr>
-      <w:r>
-        <w:t>Implementation Details:</w:t>
-        <w:br/>
-        <w:t>1. The system is deployed via Vercel for the frontend and Supabase for the backend infrastructure.</w:t>
-        <w:br/>
-        <w:t>2. Program execution requires a user to sign-up via OAuth or Email links.</w:t>
-        <w:br/>
-        <w:t>3. Maintenance consists of periodic updates to AI system prompts and updating the ATS algorithms inline with current industry trends.</w:t>
+        <w:rPr>
+          <w:rFonts w:ascii="Times New Roman" w:hAnsi="Times New Roman"/>
+          <w:b/>
+          <w:color w:val="000000"/>
+          <w:sz w:val="48"/>
+        </w:rPr>
+        <w:t>USER DOCUMENTATION</w:t>
       </w:r>
     </w:p>
     <w:p>
@@ -1635,18 +2233,17 @@
     </w:p>
     <w:p>
       <w:pPr>
-        <w:pStyle w:val="Heading1"/>
+        <w:pStyle w:val="Heading2"/>
+        <w:jc w:val="left"/>
       </w:pPr>
       <w:r>
-        <w:t>6. CONCLUSION</w:t>
-      </w:r>
-    </w:p>
-    <w:p>
-      <w:pPr>
-        <w:pStyle w:val="Heading2"/>
-      </w:pPr>
-      <w:r>
-        <w:t>6.1 LIMITATIONS OF THE SYSTEM</w:t>
+        <w:rPr>
+          <w:rFonts w:ascii="Times New Roman" w:hAnsi="Times New Roman"/>
+          <w:b/>
+          <w:color w:val="000000"/>
+          <w:u w:val="single"/>
+        </w:rPr>
+        <w:t>5.1 IMPLEMENTATION, PROGRAM EXECUTION &amp; MAINTENANCE</w:t>
       </w:r>
     </w:p>
     <w:p>
@@ -1654,31 +2251,43 @@
         <w:jc w:val="both"/>
       </w:pPr>
       <w:r>
-        <w:t>• Requires active high-speed internet connection for real-time AI suggestions.</w:t>
-        <w:br/>
-        <w:t>• Contextual limits in LLMs might miss highly specialized niche terminology natively unencountered.</w:t>
-        <w:br/>
-        <w:t>• Strict PDF parsing formatting limitations when downloading in raw environments.</w:t>
+        <w:rPr>
+          <w:rFonts w:ascii="Times New Roman" w:hAnsi="Times New Roman"/>
+          <w:sz w:val="24"/>
+        </w:rPr>
+        <w:t>The maintenance happens across the scalable architecture on Vercel.</w:t>
       </w:r>
     </w:p>
     <w:p>
+      <w:r>
+        <w:br w:type="page"/>
+      </w:r>
+    </w:p>
+    <w:p/>
+    <w:p/>
+    <w:p/>
+    <w:p/>
+    <w:p/>
+    <w:p/>
+    <w:p/>
+    <w:p/>
+    <w:p/>
+    <w:p/>
+    <w:p/>
+    <w:p/>
+    <w:p>
       <w:pPr>
-        <w:pStyle w:val="Heading2"/>
+        <w:pStyle w:val="Heading1"/>
+        <w:jc w:val="center"/>
       </w:pPr>
       <w:r>
-        <w:t>6.2 SCOPE AND FUTURE MODIFICATION</w:t>
-      </w:r>
-    </w:p>
-    <w:p>
-      <w:pPr>
-        <w:jc w:val="both"/>
-      </w:pPr>
-      <w:r>
-        <w:t>• Integration with LinkedIn for direct 1-click importing of user profiles.</w:t>
-        <w:br/>
-        <w:t>• Support for multiple file exports like proper DOCX conversion.</w:t>
-        <w:br/>
-        <w:t>• Mobile App implementation for resume management on-the-go.</w:t>
+        <w:rPr>
+          <w:rFonts w:ascii="Times New Roman" w:hAnsi="Times New Roman"/>
+          <w:b/>
+          <w:color w:val="000000"/>
+          <w:sz w:val="48"/>
+        </w:rPr>
+        <w:t>CONCLUSION</w:t>
       </w:r>
     </w:p>
     <w:p>
@@ -1688,26 +2297,95 @@
     </w:p>
     <w:p>
       <w:pPr>
-        <w:pStyle w:val="Heading1"/>
+        <w:pStyle w:val="Heading2"/>
+        <w:jc w:val="left"/>
       </w:pPr>
       <w:r>
-        <w:t>7. REFERENCES / BIBLIOGRAPHY</w:t>
+        <w:rPr>
+          <w:rFonts w:ascii="Times New Roman" w:hAnsi="Times New Roman"/>
+          <w:b/>
+          <w:color w:val="000000"/>
+          <w:u w:val="single"/>
+        </w:rPr>
+        <w:t>6.1 LIMITATIONS OF THE SYSTEM</w:t>
+      </w:r>
+    </w:p>
+    <w:p>
+      <w:pPr>
+        <w:jc w:val="both"/>
+      </w:pPr>
+      <w:r>
+        <w:rPr>
+          <w:rFonts w:ascii="Times New Roman" w:hAnsi="Times New Roman"/>
+          <w:sz w:val="24"/>
+        </w:rPr>
+        <w:t>Certain heavy PDF modules may degrade UX on low end network setups.</w:t>
+      </w:r>
+    </w:p>
+    <w:p>
+      <w:pPr>
+        <w:pStyle w:val="Heading2"/>
+        <w:jc w:val="left"/>
+      </w:pPr>
+      <w:r>
+        <w:rPr>
+          <w:rFonts w:ascii="Times New Roman" w:hAnsi="Times New Roman"/>
+          <w:b/>
+          <w:color w:val="000000"/>
+          <w:u w:val="single"/>
+        </w:rPr>
+        <w:t>6.2 SCOPE AND FUTURE MODIFICATION</w:t>
+      </w:r>
+    </w:p>
+    <w:p>
+      <w:pPr>
+        <w:jc w:val="both"/>
+      </w:pPr>
+      <w:r>
+        <w:rPr>
+          <w:rFonts w:ascii="Times New Roman" w:hAnsi="Times New Roman"/>
+          <w:sz w:val="24"/>
+        </w:rPr>
+        <w:t>Further improvements integrating mobile native application components.</w:t>
       </w:r>
     </w:p>
     <w:p>
       <w:r>
-        <w:t>1. React Documentation: https://reactjs.org/docs</w:t>
+        <w:br w:type="page"/>
+      </w:r>
+    </w:p>
+    <w:p>
+      <w:pPr>
+        <w:pStyle w:val="Heading2"/>
+        <w:jc w:val="left"/>
+      </w:pPr>
+      <w:r>
+        <w:rPr>
+          <w:rFonts w:ascii="Times New Roman" w:hAnsi="Times New Roman"/>
+          <w:b/>
+          <w:color w:val="000000"/>
+          <w:u w:val="single"/>
+        </w:rPr>
+        <w:t>7 REFERENCES / BIBLIOGRAPHY</w:t>
+      </w:r>
+    </w:p>
+    <w:p>
+      <w:pPr>
+        <w:jc w:val="both"/>
+      </w:pPr>
+      <w:r>
+        <w:rPr>
+          <w:rFonts w:ascii="Times New Roman" w:hAnsi="Times New Roman"/>
+          <w:sz w:val="24"/>
+        </w:rPr>
+        <w:t>[1] React Documentation.</w:t>
         <w:br/>
-        <w:t>2. Supabase Documentation: https://supabase.com/docs</w:t>
-        <w:br/>
-        <w:t>3. OpenAI / Anthropic APIs Context Guides.</w:t>
-        <w:br/>
-        <w:t>4. Modern Systems Analysis and Design by Hoffer et al.</w:t>
-        <w:br/>
-        <w:t>5. Applicant Tracking Algorithms and Implementation Guidelines, 2025.</w:t>
+        <w:t>[2] Supabase Data Management.</w:t>
       </w:r>
     </w:p>
     <w:sectPr>
+      <w:headerReference w:type="default" r:id="rId9"/>
+      <w:footerReference w:type="default" r:id="rId10"/>
       <w:pgSz w:w="12240" w:h="15840"/>
       <w:pgMar w:top="1440" w:right="1800" w:bottom="1440" w:left="1800" w:header="720" w:footer="720" w:gutter="0"/>
       <w:cols w:space="720"/>
@@ -1715,6 +2393,53 @@
     </w:sectPr>
   </w:body>
 </w:document>
+</file>
+
+<file path=word/footer1.xml><?xml version="1.0" encoding="utf-8"?>
+<w:ftr xmlns:m="http://schemas.openxmlformats.org/officeDocument/2006/math" xmlns:mc="http://schemas.openxmlformats.org/markup-compatibility/2006" xmlns:mo="http://schemas.microsoft.com/office/mac/office/2008/main" xmlns:mv="urn:schemas-microsoft-com:mac:vml" xmlns:o="urn:schemas-microsoft-com:office:office" xmlns:r="http://schemas.openxmlformats.org/officeDocument/2006/relationships" xmlns:v="urn:schemas-microsoft-com:vml" xmlns:w10="urn:schemas-microsoft-com:office:word" xmlns:w14="http://schemas.microsoft.com/office/word/2010/wordml" xmlns:w="http://schemas.openxmlformats.org/wordprocessingml/2006/main" xmlns:wne="http://schemas.microsoft.com/office/word/2006/wordml" xmlns:wp14="http://schemas.microsoft.com/office/word/2010/wordprocessingDrawing" xmlns:wp="http://schemas.openxmlformats.org/drawingml/2006/wordprocessingDrawing" xmlns:wpc="http://schemas.microsoft.com/office/word/2010/wordprocessingCanvas" xmlns:wpg="http://schemas.microsoft.com/office/word/2010/wordprocessingGroup" xmlns:wpi="http://schemas.microsoft.com/office/word/2010/wordprocessingInk" xmlns:wps="http://schemas.microsoft.com/office/word/2010/wordprocessingShape" mc:Ignorable="w14 wp14">
+  <w:p>
+    <w:pPr>
+      <w:pStyle w:val="Footer"/>
+      <w:jc w:val="left"/>
+    </w:pPr>
+    <w:r>
+      <w:rPr>
+        <w:rFonts w:ascii="Times New Roman" w:hAnsi="Times New Roman"/>
+        <w:b/>
+        <w:sz w:val="20"/>
+      </w:rPr>
+      <w:t>————————————————————————————————————————————————————————————</w:t>
+      <w:br/>
+      <w:t>Janaprabha Institute of Engineering and Technology</w:t>
+      <w:tab/>
+      <w:tab/>
+      <w:tab/>
+      <w:tab/>
+      <w:t xml:space="preserve">Pg. </w:t>
+    </w:r>
+  </w:p>
+</w:ftr>
+</file>
+
+<file path=word/header1.xml><?xml version="1.0" encoding="utf-8"?>
+<w:hdr xmlns:m="http://schemas.openxmlformats.org/officeDocument/2006/math" xmlns:mc="http://schemas.openxmlformats.org/markup-compatibility/2006" xmlns:mo="http://schemas.microsoft.com/office/mac/office/2008/main" xmlns:mv="urn:schemas-microsoft-com:mac:vml" xmlns:o="urn:schemas-microsoft-com:office:office" xmlns:r="http://schemas.openxmlformats.org/officeDocument/2006/relationships" xmlns:v="urn:schemas-microsoft-com:vml" xmlns:w10="urn:schemas-microsoft-com:office:word" xmlns:w14="http://schemas.microsoft.com/office/word/2010/wordml" xmlns:w="http://schemas.openxmlformats.org/wordprocessingml/2006/main" xmlns:wne="http://schemas.microsoft.com/office/word/2006/wordml" xmlns:wp14="http://schemas.microsoft.com/office/word/2010/wordprocessingDrawing" xmlns:wp="http://schemas.openxmlformats.org/drawingml/2006/wordprocessingDrawing" xmlns:wpc="http://schemas.microsoft.com/office/word/2010/wordprocessingCanvas" xmlns:wpg="http://schemas.microsoft.com/office/word/2010/wordprocessingGroup" xmlns:wpi="http://schemas.microsoft.com/office/word/2010/wordprocessingInk" xmlns:wps="http://schemas.microsoft.com/office/word/2010/wordprocessingShape" mc:Ignorable="w14 wp14">
+  <w:p>
+    <w:pPr>
+      <w:pStyle w:val="Header"/>
+      <w:jc w:val="right"/>
+    </w:pPr>
+    <w:r>
+      <w:rPr>
+        <w:rFonts w:ascii="Times New Roman" w:hAnsi="Times New Roman"/>
+        <w:b/>
+        <w:sz w:val="20"/>
+      </w:rPr>
+      <w:t>AI Resume Studio</w:t>
+      <w:br/>
+      <w:t>————————————————————————————————————————————————————————————</w:t>
+    </w:r>
+  </w:p>
+</w:hdr>
 </file>
 
 <file path=word/numbering.xml><?xml version="1.0" encoding="utf-8"?>

</xml_diff>

<commit_message>
Update BCA reports: generate both identical DOCX and PDF versions for thesis and practical files
</commit_message>
<xml_diff>
--- a/data/Generated_Reports/Practical_Project_Report.docx
+++ b/data/Generated_Reports/Practical_Project_Report.docx
@@ -1102,18 +1102,6 @@
         <w:br w:type="page"/>
       </w:r>
     </w:p>
-    <w:p/>
-    <w:p/>
-    <w:p/>
-    <w:p/>
-    <w:p/>
-    <w:p/>
-    <w:p/>
-    <w:p/>
-    <w:p/>
-    <w:p/>
-    <w:p/>
-    <w:p/>
     <w:p>
       <w:pPr>
         <w:pStyle w:val="Heading1"/>
@@ -1124,14 +1112,8 @@
           <w:rFonts w:ascii="Times New Roman" w:hAnsi="Times New Roman"/>
           <w:b/>
           <w:color w:val="000000"/>
-          <w:sz w:val="48"/>
         </w:rPr>
         <w:t>BRIEF REVIEW OF THE PROJECT</w:t>
-      </w:r>
-    </w:p>
-    <w:p>
-      <w:r>
-        <w:br w:type="page"/>
       </w:r>
     </w:p>
     <w:p>
@@ -1185,124 +1167,7 @@
           <w:rFonts w:ascii="Times New Roman" w:hAnsi="Times New Roman"/>
           <w:sz w:val="24"/>
         </w:rPr>
-        <w:t>The online resume building ecosystem is a very popular platform for job seekers. Many companies are now enforcing strict Applicant Tracking System (ATS) parsing systems. Our AI Resume Studio provides facilities like smart skill and language proficiency detection, auto ATS scores, intelligent summary generation, and interactive resume dashboards. It acts similarly to modern portfolio systems but has advanced AI features making recruitment easier.</w:t>
-      </w:r>
-    </w:p>
-    <w:p>
-      <w:pPr>
-        <w:pStyle w:val="Heading2"/>
-        <w:jc w:val="left"/>
-      </w:pPr>
-      <w:r>
-        <w:rPr>
-          <w:rFonts w:ascii="Times New Roman" w:hAnsi="Times New Roman"/>
-          <w:b/>
-          <w:color w:val="000000"/>
-          <w:u w:val="single"/>
-        </w:rPr>
-        <w:t>1.3 PRELIMINARY INVESTIGATION</w:t>
-      </w:r>
-    </w:p>
-    <w:p>
-      <w:pPr>
-        <w:jc w:val="both"/>
-      </w:pPr>
-      <w:r>
-        <w:rPr>
-          <w:rFonts w:ascii="Times New Roman" w:hAnsi="Times New Roman"/>
-          <w:sz w:val="24"/>
-        </w:rPr>
-        <w:t>A preliminary investigation of resume builders typically involves examining various aspects related to ATS functionalities. Here is a breakdown:</w:t>
-      </w:r>
-    </w:p>
-    <w:p>
-      <w:pPr>
-        <w:jc w:val="both"/>
-      </w:pPr>
-      <w:r>
-        <w:rPr>
-          <w:rFonts w:ascii="Times New Roman" w:hAnsi="Times New Roman"/>
-          <w:sz w:val="24"/>
-        </w:rPr>
-        <w:t>1. Technology Infrastructure: Assess the technological requirements, including React interface, APIs, PDF generation limitations.</w:t>
-      </w:r>
-    </w:p>
-    <w:p>
-      <w:pPr>
-        <w:jc w:val="both"/>
-      </w:pPr>
-      <w:r>
-        <w:rPr>
-          <w:rFonts w:ascii="Times New Roman" w:hAnsi="Times New Roman"/>
-          <w:sz w:val="24"/>
-        </w:rPr>
-        <w:t>2. Assessment and Feedback: Evaluate the mechanisms of real-time ATS feedback systems across formats.</w:t>
-      </w:r>
-    </w:p>
-    <w:p>
-      <w:pPr>
-        <w:jc w:val="both"/>
-      </w:pPr>
-      <w:r>
-        <w:rPr>
-          <w:rFonts w:ascii="Times New Roman" w:hAnsi="Times New Roman"/>
-          <w:sz w:val="24"/>
-        </w:rPr>
-        <w:t>3. Data Privacy and Security: Investigate measures ensuring user PDF data privacy and secure authentication via Supabase.</w:t>
-      </w:r>
-    </w:p>
-    <w:p>
-      <w:pPr>
-        <w:pStyle w:val="Heading2"/>
-        <w:jc w:val="left"/>
-      </w:pPr>
-      <w:r>
-        <w:rPr>
-          <w:rFonts w:ascii="Times New Roman" w:hAnsi="Times New Roman"/>
-          <w:b/>
-          <w:color w:val="000000"/>
-          <w:u w:val="single"/>
-        </w:rPr>
-        <w:t>1.4 FLAWS IN PRESENT SYSTEM</w:t>
-      </w:r>
-    </w:p>
-    <w:p>
-      <w:pPr>
-        <w:jc w:val="both"/>
-      </w:pPr>
-      <w:r>
-        <w:rPr>
-          <w:rFonts w:ascii="Times New Roman" w:hAnsi="Times New Roman"/>
-          <w:sz w:val="24"/>
-        </w:rPr>
-        <w:t>Current generic platforms lack structured AI suggestions and native ATS grading metrics, meaning users miss out on keyword insertions blindly.</w:t>
-      </w:r>
-    </w:p>
-    <w:p>
-      <w:pPr>
-        <w:pStyle w:val="Heading2"/>
-        <w:jc w:val="left"/>
-      </w:pPr>
-      <w:r>
-        <w:rPr>
-          <w:rFonts w:ascii="Times New Roman" w:hAnsi="Times New Roman"/>
-          <w:b/>
-          <w:color w:val="000000"/>
-          <w:u w:val="single"/>
-        </w:rPr>
-        <w:t>1.5 NEED OF NEW SYSTEM</w:t>
-      </w:r>
-    </w:p>
-    <w:p>
-      <w:pPr>
-        <w:jc w:val="both"/>
-      </w:pPr>
-      <w:r>
-        <w:rPr>
-          <w:rFonts w:ascii="Times New Roman" w:hAnsi="Times New Roman"/>
-          <w:sz w:val="24"/>
-        </w:rPr>
-        <w:t>Our AI Resume Studio online system has significant facilities that a user or recruiter can utilize. The system intelligently detects job description overlaps and calculates an exact ATS fit percentage.</w:t>
+        <w:t>The online resume building ecosystem is a very popular platform for job seekers. Our AI Resume Studio provides facilities like smart skill detection, auto ATS scores, and intelligent summaries.</w:t>
       </w:r>
     </w:p>
     <w:p>
@@ -1310,18 +1175,6 @@
         <w:br w:type="page"/>
       </w:r>
     </w:p>
-    <w:p/>
-    <w:p/>
-    <w:p/>
-    <w:p/>
-    <w:p/>
-    <w:p/>
-    <w:p/>
-    <w:p/>
-    <w:p/>
-    <w:p/>
-    <w:p/>
-    <w:p/>
     <w:p>
       <w:pPr>
         <w:pStyle w:val="Heading1"/>
@@ -1332,14 +1185,8 @@
           <w:rFonts w:ascii="Times New Roman" w:hAnsi="Times New Roman"/>
           <w:b/>
           <w:color w:val="000000"/>
-          <w:sz w:val="48"/>
         </w:rPr>
         <w:t>DETAILED SYSTEM DESIGN</w:t>
-      </w:r>
-    </w:p>
-    <w:p>
-      <w:r>
-        <w:br w:type="page"/>
       </w:r>
     </w:p>
     <w:p>
@@ -1355,18 +1202,6 @@
           <w:u w:val="single"/>
         </w:rPr>
         <w:t>2.1 SYSTEM FLOW CHART</w:t>
-      </w:r>
-    </w:p>
-    <w:p>
-      <w:pPr>
-        <w:pStyle w:val="ListBullet"/>
-      </w:pPr>
-      <w:r>
-        <w:rPr>
-          <w:rFonts w:ascii="Times New Roman" w:hAnsi="Times New Roman"/>
-          <w:sz w:val="24"/>
-        </w:rPr>
-        <w:t>System Flow Diagram for Admin:</w:t>
       </w:r>
     </w:p>
     <w:p>
@@ -1403,18 +1238,6 @@
             </a:graphic>
           </wp:inline>
         </w:drawing>
-      </w:r>
-    </w:p>
-    <w:p>
-      <w:pPr>
-        <w:pStyle w:val="ListBullet"/>
-      </w:pPr>
-      <w:r>
-        <w:rPr>
-          <w:rFonts w:ascii="Times New Roman" w:hAnsi="Times New Roman"/>
-          <w:sz w:val="24"/>
-        </w:rPr>
-        <w:t>System Flow Diagram for User:</w:t>
       </w:r>
     </w:p>
     <w:p>
@@ -1465,46 +1288,7 @@
           <w:color w:val="000000"/>
           <w:u w:val="single"/>
         </w:rPr>
-        <w:t>2.2 DETAILS OF LOGIC DEVELOPED</w:t>
-      </w:r>
-    </w:p>
-    <w:p>
-      <w:pPr>
-        <w:jc w:val="both"/>
-      </w:pPr>
-      <w:r>
-        <w:rPr>
-          <w:rFonts w:ascii="Times New Roman" w:hAnsi="Times New Roman"/>
-          <w:sz w:val="24"/>
-        </w:rPr>
-        <w:t>The logic was developed using the React functional components state. The AI logic was built connecting an external API (Claude Opus) and processing chunks of texts into exact structural points.</w:t>
-      </w:r>
-    </w:p>
-    <w:p>
-      <w:pPr>
-        <w:pStyle w:val="Heading2"/>
-        <w:jc w:val="left"/>
-      </w:pPr>
-      <w:r>
-        <w:rPr>
-          <w:rFonts w:ascii="Times New Roman" w:hAnsi="Times New Roman"/>
-          <w:b/>
-          <w:color w:val="000000"/>
-          <w:u w:val="single"/>
-        </w:rPr>
         <w:t>2.3 STRUCTURE DIAGRAM OF EACH MODULE</w:t>
-      </w:r>
-    </w:p>
-    <w:p>
-      <w:pPr>
-        <w:pStyle w:val="ListBullet"/>
-      </w:pPr>
-      <w:r>
-        <w:rPr>
-          <w:rFonts w:ascii="Times New Roman" w:hAnsi="Times New Roman"/>
-          <w:sz w:val="24"/>
-        </w:rPr>
-        <w:t>Activity diagram for Admin:</w:t>
       </w:r>
     </w:p>
     <w:p>
@@ -1545,23 +1329,6 @@
     </w:p>
     <w:p>
       <w:r>
-        <w:br w:type="page"/>
-      </w:r>
-    </w:p>
-    <w:p>
-      <w:pPr>
-        <w:pStyle w:val="ListBullet"/>
-      </w:pPr>
-      <w:r>
-        <w:rPr>
-          <w:rFonts w:ascii="Times New Roman" w:hAnsi="Times New Roman"/>
-          <w:sz w:val="24"/>
-        </w:rPr>
-        <w:t>Activity diagram for User:</w:t>
-      </w:r>
-    </w:p>
-    <w:p>
-      <w:r>
         <w:drawing>
           <wp:inline xmlns:a="http://schemas.openxmlformats.org/drawingml/2006/main" xmlns:pic="http://schemas.openxmlformats.org/drawingml/2006/picture">
             <wp:extent cx="4572000" cy="6258812"/>
@@ -1597,284 +1364,6 @@
       </w:r>
     </w:p>
     <w:p>
-      <w:pPr>
-        <w:pStyle w:val="ListBullet"/>
-      </w:pPr>
-      <w:r>
-        <w:rPr>
-          <w:rFonts w:ascii="Times New Roman" w:hAnsi="Times New Roman"/>
-          <w:sz w:val="24"/>
-        </w:rPr>
-        <w:t>State Diagram of Admin:</w:t>
-      </w:r>
-    </w:p>
-    <w:p>
-      <w:r>
-        <w:drawing>
-          <wp:inline xmlns:a="http://schemas.openxmlformats.org/drawingml/2006/main" xmlns:pic="http://schemas.openxmlformats.org/drawingml/2006/picture">
-            <wp:extent cx="3657600" cy="3086911"/>
-            <wp:docPr id="5" name="Picture 5"/>
-            <wp:cNvGraphicFramePr>
-              <a:graphicFrameLocks noChangeAspect="1"/>
-            </wp:cNvGraphicFramePr>
-            <a:graphic>
-              <a:graphicData uri="http://schemas.openxmlformats.org/drawingml/2006/picture">
-                <pic:pic>
-                  <pic:nvPicPr>
-                    <pic:cNvPr id="0" name="state_admin.png"/>
-                    <pic:cNvPicPr/>
-                  </pic:nvPicPr>
-                  <pic:blipFill>
-                    <a:blip r:embed="rId15"/>
-                    <a:stretch>
-                      <a:fillRect/>
-                    </a:stretch>
-                  </pic:blipFill>
-                  <pic:spPr>
-                    <a:xfrm>
-                      <a:off x="0" y="0"/>
-                      <a:ext cx="3657600" cy="3086911"/>
-                    </a:xfrm>
-                    <a:prstGeom prst="rect"/>
-                  </pic:spPr>
-                </pic:pic>
-              </a:graphicData>
-            </a:graphic>
-          </wp:inline>
-        </w:drawing>
-      </w:r>
-    </w:p>
-    <w:p>
-      <w:pPr>
-        <w:pStyle w:val="ListBullet"/>
-      </w:pPr>
-      <w:r>
-        <w:rPr>
-          <w:rFonts w:ascii="Times New Roman" w:hAnsi="Times New Roman"/>
-          <w:sz w:val="24"/>
-        </w:rPr>
-        <w:t>State Diagram of User:</w:t>
-      </w:r>
-    </w:p>
-    <w:p>
-      <w:r>
-        <w:drawing>
-          <wp:inline xmlns:a="http://schemas.openxmlformats.org/drawingml/2006/main" xmlns:pic="http://schemas.openxmlformats.org/drawingml/2006/picture">
-            <wp:extent cx="3657600" cy="7134578"/>
-            <wp:docPr id="6" name="Picture 6"/>
-            <wp:cNvGraphicFramePr>
-              <a:graphicFrameLocks noChangeAspect="1"/>
-            </wp:cNvGraphicFramePr>
-            <a:graphic>
-              <a:graphicData uri="http://schemas.openxmlformats.org/drawingml/2006/picture">
-                <pic:pic>
-                  <pic:nvPicPr>
-                    <pic:cNvPr id="0" name="state_user.png"/>
-                    <pic:cNvPicPr/>
-                  </pic:nvPicPr>
-                  <pic:blipFill>
-                    <a:blip r:embed="rId16"/>
-                    <a:stretch>
-                      <a:fillRect/>
-                    </a:stretch>
-                  </pic:blipFill>
-                  <pic:spPr>
-                    <a:xfrm>
-                      <a:off x="0" y="0"/>
-                      <a:ext cx="3657600" cy="7134578"/>
-                    </a:xfrm>
-                    <a:prstGeom prst="rect"/>
-                  </pic:spPr>
-                </pic:pic>
-              </a:graphicData>
-            </a:graphic>
-          </wp:inline>
-        </w:drawing>
-      </w:r>
-    </w:p>
-    <w:p>
-      <w:r>
-        <w:br w:type="page"/>
-      </w:r>
-    </w:p>
-    <w:p>
-      <w:pPr>
-        <w:pStyle w:val="Heading2"/>
-        <w:jc w:val="left"/>
-      </w:pPr>
-      <w:r>
-        <w:rPr>
-          <w:rFonts w:ascii="Times New Roman" w:hAnsi="Times New Roman"/>
-          <w:b/>
-          <w:color w:val="000000"/>
-          <w:u w:val="single"/>
-        </w:rPr>
-        <w:t>2.4 DATA DICTIONARY</w:t>
-      </w:r>
-    </w:p>
-    <w:p>
-      <w:pPr>
-        <w:jc w:val="both"/>
-      </w:pPr>
-      <w:r>
-        <w:rPr>
-          <w:rFonts w:ascii="Times New Roman" w:hAnsi="Times New Roman"/>
-          <w:sz w:val="24"/>
-        </w:rPr>
-        <w:t>Database: Supabase PostgreSQL. Tables include 'resumes', 'profiles', etc.</w:t>
-      </w:r>
-    </w:p>
-    <w:p>
-      <w:pPr>
-        <w:pStyle w:val="Heading2"/>
-        <w:jc w:val="left"/>
-      </w:pPr>
-      <w:r>
-        <w:rPr>
-          <w:rFonts w:ascii="Times New Roman" w:hAnsi="Times New Roman"/>
-          <w:b/>
-          <w:color w:val="000000"/>
-          <w:u w:val="single"/>
-        </w:rPr>
-        <w:t>2.5 DATA FLOW DIAGRAMS</w:t>
-      </w:r>
-    </w:p>
-    <w:p>
-      <w:pPr>
-        <w:jc w:val="both"/>
-      </w:pPr>
-      <w:r>
-        <w:rPr>
-          <w:rFonts w:ascii="Times New Roman" w:hAnsi="Times New Roman"/>
-          <w:sz w:val="24"/>
-        </w:rPr>
-        <w:t>See flow diagrams indicated previously.</w:t>
-      </w:r>
-    </w:p>
-    <w:p>
-      <w:r>
-        <w:br w:type="page"/>
-      </w:r>
-    </w:p>
-    <w:p/>
-    <w:p/>
-    <w:p/>
-    <w:p/>
-    <w:p/>
-    <w:p/>
-    <w:p/>
-    <w:p/>
-    <w:p/>
-    <w:p/>
-    <w:p/>
-    <w:p/>
-    <w:p>
-      <w:pPr>
-        <w:pStyle w:val="Heading1"/>
-        <w:jc w:val="center"/>
-      </w:pPr>
-      <w:r>
-        <w:rPr>
-          <w:rFonts w:ascii="Times New Roman" w:hAnsi="Times New Roman"/>
-          <w:b/>
-          <w:color w:val="000000"/>
-          <w:sz w:val="48"/>
-        </w:rPr>
-        <w:t>SOFTWARE/ HARDWARE DETAILS</w:t>
-      </w:r>
-    </w:p>
-    <w:p>
-      <w:r>
-        <w:br w:type="page"/>
-      </w:r>
-    </w:p>
-    <w:p>
-      <w:pPr>
-        <w:pStyle w:val="Heading2"/>
-        <w:jc w:val="left"/>
-      </w:pPr>
-      <w:r>
-        <w:rPr>
-          <w:rFonts w:ascii="Times New Roman" w:hAnsi="Times New Roman"/>
-          <w:b/>
-          <w:color w:val="000000"/>
-          <w:u w:val="single"/>
-        </w:rPr>
-        <w:t>3.1 CHOICE OF A LANGUAGE USED</w:t>
-      </w:r>
-    </w:p>
-    <w:p>
-      <w:pPr>
-        <w:jc w:val="both"/>
-      </w:pPr>
-      <w:r>
-        <w:rPr>
-          <w:rFonts w:ascii="Times New Roman" w:hAnsi="Times New Roman"/>
-          <w:sz w:val="24"/>
-        </w:rPr>
-        <w:t>TypeScript, React, Node.js, Python for scripting.</w:t>
-      </w:r>
-    </w:p>
-    <w:p>
-      <w:pPr>
-        <w:pStyle w:val="Heading2"/>
-        <w:jc w:val="left"/>
-      </w:pPr>
-      <w:r>
-        <w:rPr>
-          <w:rFonts w:ascii="Times New Roman" w:hAnsi="Times New Roman"/>
-          <w:b/>
-          <w:color w:val="000000"/>
-          <w:u w:val="single"/>
-        </w:rPr>
-        <w:t>3.2 HARDWARE/ SOFTWARE SPECIFICATION</w:t>
-      </w:r>
-    </w:p>
-    <w:p>
-      <w:pPr>
-        <w:jc w:val="both"/>
-      </w:pPr>
-      <w:r>
-        <w:rPr>
-          <w:rFonts w:ascii="Times New Roman" w:hAnsi="Times New Roman"/>
-          <w:sz w:val="24"/>
-        </w:rPr>
-        <w:t>Any Web Browser, Minimum 4GB Ram system.</w:t>
-      </w:r>
-    </w:p>
-    <w:p>
-      <w:r>
-        <w:br w:type="page"/>
-      </w:r>
-    </w:p>
-    <w:p/>
-    <w:p/>
-    <w:p/>
-    <w:p/>
-    <w:p/>
-    <w:p/>
-    <w:p/>
-    <w:p/>
-    <w:p/>
-    <w:p/>
-    <w:p/>
-    <w:p/>
-    <w:p>
-      <w:pPr>
-        <w:pStyle w:val="Heading1"/>
-        <w:jc w:val="center"/>
-      </w:pPr>
-      <w:r>
-        <w:rPr>
-          <w:rFonts w:ascii="Times New Roman" w:hAnsi="Times New Roman"/>
-          <w:b/>
-          <w:color w:val="000000"/>
-          <w:sz w:val="48"/>
-        </w:rPr>
-        <w:t>SYSTEM DESIGN</w:t>
-      </w:r>
-    </w:p>
-    <w:p>
       <w:r>
         <w:br w:type="page"/>
       </w:r>
@@ -1892,18 +1381,6 @@
           <w:u w:val="single"/>
         </w:rPr>
         <w:t>4.1 PROGRAM LISTING</w:t>
-      </w:r>
-    </w:p>
-    <w:p>
-      <w:pPr>
-        <w:jc w:val="both"/>
-      </w:pPr>
-      <w:r>
-        <w:rPr>
-          <w:rFonts w:ascii="Times New Roman" w:hAnsi="Times New Roman"/>
-          <w:sz w:val="24"/>
-        </w:rPr>
-        <w:t>Below is the execution code (src/pages/Index.tsx snippet):</w:t>
       </w:r>
     </w:p>
     <w:p>
@@ -1968,22 +1445,9 @@
         <w:br/>
         <w:t xml:space="preserve">              &lt;p className="text-xl font-bold text-foreground"&gt;ResumeGPT&lt;/p&gt;</w:t>
         <w:br/>
-        <w:t xml:space="preserve">              &lt;p className="text-xs text-muted-foreground"&gt;Professional Resume Builder&lt;/p&gt;</w:t>
+        <w:t xml:space="preserve">              &lt;p className="text</w:t>
         <w:br/>
-        <w:t xml:space="preserve">            &lt;/div&gt;</w:t>
-        <w:br/>
-        <w:t xml:space="preserve">          &lt;/a&gt;</w:t>
-        <w:br/>
-        <w:br/>
-        <w:t xml:space="preserve">          &lt;nav className="hidden md:flex items-center gap-3"&gt;</w:t>
-        <w:br/>
-        <w:t xml:space="preserve">            &lt;a</w:t>
-        <w:br/>
-        <w:t xml:space="preserve">              href="/create"</w:t>
-        <w:br/>
-        <w:t xml:space="preserve">              className="flex items-center gap-1 px-4 py-2 rounded-lg font-medium text-primary-foreg</w:t>
-        <w:br/>
-        <w:t>... [Code Truncated]</w:t>
+        <w:t>... [Truncated]</w:t>
       </w:r>
     </w:p>
     <w:p>
@@ -2007,23 +1471,11 @@
       </w:r>
     </w:p>
     <w:p>
-      <w:pPr>
-        <w:jc w:val="both"/>
-      </w:pPr>
-      <w:r>
-        <w:rPr>
-          <w:rFonts w:ascii="Times New Roman" w:hAnsi="Times New Roman"/>
-          <w:sz w:val="24"/>
-        </w:rPr>
-        <w:t>Platform landing and input interfaces.</w:t>
-      </w:r>
-    </w:p>
-    <w:p>
       <w:r>
         <w:drawing>
           <wp:inline xmlns:a="http://schemas.openxmlformats.org/drawingml/2006/main" xmlns:pic="http://schemas.openxmlformats.org/drawingml/2006/picture">
             <wp:extent cx="5486400" cy="3429000"/>
-            <wp:docPr id="7" name="Picture 7"/>
+            <wp:docPr id="5" name="Picture 5"/>
             <wp:cNvGraphicFramePr>
               <a:graphicFrameLocks noChangeAspect="1"/>
             </wp:cNvGraphicFramePr>
@@ -2035,7 +1487,7 @@
                     <pic:cNvPicPr/>
                   </pic:nvPicPr>
                   <pic:blipFill>
-                    <a:blip r:embed="rId17"/>
+                    <a:blip r:embed="rId15"/>
                     <a:stretch>
                       <a:fillRect/>
                     </a:stretch>
@@ -2052,18 +1504,6 @@
             </a:graphic>
           </wp:inline>
         </w:drawing>
-      </w:r>
-    </w:p>
-    <w:p>
-      <w:pPr>
-        <w:jc w:val="center"/>
-      </w:pPr>
-      <w:r>
-        <w:rPr>
-          <w:rFonts w:ascii="Times New Roman" w:hAnsi="Times New Roman"/>
-          <w:sz w:val="24"/>
-        </w:rPr>
-        <w:t>Fig: Landing Page Input</w:t>
       </w:r>
     </w:p>
     <w:p>
@@ -2087,23 +1527,11 @@
       </w:r>
     </w:p>
     <w:p>
-      <w:pPr>
-        <w:jc w:val="both"/>
-      </w:pPr>
-      <w:r>
-        <w:rPr>
-          <w:rFonts w:ascii="Times New Roman" w:hAnsi="Times New Roman"/>
-          <w:sz w:val="24"/>
-        </w:rPr>
-        <w:t>Builder output screens and Dashboard.</w:t>
-      </w:r>
-    </w:p>
-    <w:p>
       <w:r>
         <w:drawing>
           <wp:inline xmlns:a="http://schemas.openxmlformats.org/drawingml/2006/main" xmlns:pic="http://schemas.openxmlformats.org/drawingml/2006/picture">
             <wp:extent cx="5486400" cy="3429000"/>
-            <wp:docPr id="8" name="Picture 8"/>
+            <wp:docPr id="6" name="Picture 6"/>
             <wp:cNvGraphicFramePr>
               <a:graphicFrameLocks noChangeAspect="1"/>
             </wp:cNvGraphicFramePr>
@@ -2115,7 +1543,7 @@
                     <pic:cNvPicPr/>
                   </pic:nvPicPr>
                   <pic:blipFill>
-                    <a:blip r:embed="rId18"/>
+                    <a:blip r:embed="rId16"/>
                     <a:stretch>
                       <a:fillRect/>
                     </a:stretch>
@@ -2135,23 +1563,11 @@
       </w:r>
     </w:p>
     <w:p>
-      <w:pPr>
-        <w:jc w:val="center"/>
-      </w:pPr>
-      <w:r>
-        <w:rPr>
-          <w:rFonts w:ascii="Times New Roman" w:hAnsi="Times New Roman"/>
-          <w:sz w:val="24"/>
-        </w:rPr>
-        <w:t>Fig: Builder Generation Page</w:t>
-      </w:r>
-    </w:p>
-    <w:p>
       <w:r>
         <w:drawing>
           <wp:inline xmlns:a="http://schemas.openxmlformats.org/drawingml/2006/main" xmlns:pic="http://schemas.openxmlformats.org/drawingml/2006/picture">
             <wp:extent cx="5486400" cy="3429000"/>
-            <wp:docPr id="9" name="Picture 9"/>
+            <wp:docPr id="7" name="Picture 7"/>
             <wp:cNvGraphicFramePr>
               <a:graphicFrameLocks noChangeAspect="1"/>
             </wp:cNvGraphicFramePr>
@@ -2163,7 +1579,7 @@
                     <pic:cNvPicPr/>
                   </pic:nvPicPr>
                   <pic:blipFill>
-                    <a:blip r:embed="rId19"/>
+                    <a:blip r:embed="rId17"/>
                     <a:stretch>
                       <a:fillRect/>
                     </a:stretch>
@@ -2182,207 +1598,6 @@
         </w:drawing>
       </w:r>
     </w:p>
-    <w:p>
-      <w:pPr>
-        <w:jc w:val="center"/>
-      </w:pPr>
-      <w:r>
-        <w:rPr>
-          <w:rFonts w:ascii="Times New Roman" w:hAnsi="Times New Roman"/>
-          <w:sz w:val="24"/>
-        </w:rPr>
-        <w:t>Fig: Dashboard Output Screen</w:t>
-      </w:r>
-    </w:p>
-    <w:p>
-      <w:r>
-        <w:br w:type="page"/>
-      </w:r>
-    </w:p>
-    <w:p/>
-    <w:p/>
-    <w:p/>
-    <w:p/>
-    <w:p/>
-    <w:p/>
-    <w:p/>
-    <w:p/>
-    <w:p/>
-    <w:p/>
-    <w:p/>
-    <w:p/>
-    <w:p>
-      <w:pPr>
-        <w:pStyle w:val="Heading1"/>
-        <w:jc w:val="center"/>
-      </w:pPr>
-      <w:r>
-        <w:rPr>
-          <w:rFonts w:ascii="Times New Roman" w:hAnsi="Times New Roman"/>
-          <w:b/>
-          <w:color w:val="000000"/>
-          <w:sz w:val="48"/>
-        </w:rPr>
-        <w:t>USER DOCUMENTATION</w:t>
-      </w:r>
-    </w:p>
-    <w:p>
-      <w:r>
-        <w:br w:type="page"/>
-      </w:r>
-    </w:p>
-    <w:p>
-      <w:pPr>
-        <w:pStyle w:val="Heading2"/>
-        <w:jc w:val="left"/>
-      </w:pPr>
-      <w:r>
-        <w:rPr>
-          <w:rFonts w:ascii="Times New Roman" w:hAnsi="Times New Roman"/>
-          <w:b/>
-          <w:color w:val="000000"/>
-          <w:u w:val="single"/>
-        </w:rPr>
-        <w:t>5.1 IMPLEMENTATION, PROGRAM EXECUTION &amp; MAINTENANCE</w:t>
-      </w:r>
-    </w:p>
-    <w:p>
-      <w:pPr>
-        <w:jc w:val="both"/>
-      </w:pPr>
-      <w:r>
-        <w:rPr>
-          <w:rFonts w:ascii="Times New Roman" w:hAnsi="Times New Roman"/>
-          <w:sz w:val="24"/>
-        </w:rPr>
-        <w:t>The maintenance happens across the scalable architecture on Vercel.</w:t>
-      </w:r>
-    </w:p>
-    <w:p>
-      <w:r>
-        <w:br w:type="page"/>
-      </w:r>
-    </w:p>
-    <w:p/>
-    <w:p/>
-    <w:p/>
-    <w:p/>
-    <w:p/>
-    <w:p/>
-    <w:p/>
-    <w:p/>
-    <w:p/>
-    <w:p/>
-    <w:p/>
-    <w:p/>
-    <w:p>
-      <w:pPr>
-        <w:pStyle w:val="Heading1"/>
-        <w:jc w:val="center"/>
-      </w:pPr>
-      <w:r>
-        <w:rPr>
-          <w:rFonts w:ascii="Times New Roman" w:hAnsi="Times New Roman"/>
-          <w:b/>
-          <w:color w:val="000000"/>
-          <w:sz w:val="48"/>
-        </w:rPr>
-        <w:t>CONCLUSION</w:t>
-      </w:r>
-    </w:p>
-    <w:p>
-      <w:r>
-        <w:br w:type="page"/>
-      </w:r>
-    </w:p>
-    <w:p>
-      <w:pPr>
-        <w:pStyle w:val="Heading2"/>
-        <w:jc w:val="left"/>
-      </w:pPr>
-      <w:r>
-        <w:rPr>
-          <w:rFonts w:ascii="Times New Roman" w:hAnsi="Times New Roman"/>
-          <w:b/>
-          <w:color w:val="000000"/>
-          <w:u w:val="single"/>
-        </w:rPr>
-        <w:t>6.1 LIMITATIONS OF THE SYSTEM</w:t>
-      </w:r>
-    </w:p>
-    <w:p>
-      <w:pPr>
-        <w:jc w:val="both"/>
-      </w:pPr>
-      <w:r>
-        <w:rPr>
-          <w:rFonts w:ascii="Times New Roman" w:hAnsi="Times New Roman"/>
-          <w:sz w:val="24"/>
-        </w:rPr>
-        <w:t>Certain heavy PDF modules may degrade UX on low end network setups.</w:t>
-      </w:r>
-    </w:p>
-    <w:p>
-      <w:pPr>
-        <w:pStyle w:val="Heading2"/>
-        <w:jc w:val="left"/>
-      </w:pPr>
-      <w:r>
-        <w:rPr>
-          <w:rFonts w:ascii="Times New Roman" w:hAnsi="Times New Roman"/>
-          <w:b/>
-          <w:color w:val="000000"/>
-          <w:u w:val="single"/>
-        </w:rPr>
-        <w:t>6.2 SCOPE AND FUTURE MODIFICATION</w:t>
-      </w:r>
-    </w:p>
-    <w:p>
-      <w:pPr>
-        <w:jc w:val="both"/>
-      </w:pPr>
-      <w:r>
-        <w:rPr>
-          <w:rFonts w:ascii="Times New Roman" w:hAnsi="Times New Roman"/>
-          <w:sz w:val="24"/>
-        </w:rPr>
-        <w:t>Further improvements integrating mobile native application components.</w:t>
-      </w:r>
-    </w:p>
-    <w:p>
-      <w:r>
-        <w:br w:type="page"/>
-      </w:r>
-    </w:p>
-    <w:p>
-      <w:pPr>
-        <w:pStyle w:val="Heading2"/>
-        <w:jc w:val="left"/>
-      </w:pPr>
-      <w:r>
-        <w:rPr>
-          <w:rFonts w:ascii="Times New Roman" w:hAnsi="Times New Roman"/>
-          <w:b/>
-          <w:color w:val="000000"/>
-          <w:u w:val="single"/>
-        </w:rPr>
-        <w:t>7 REFERENCES / BIBLIOGRAPHY</w:t>
-      </w:r>
-    </w:p>
-    <w:p>
-      <w:pPr>
-        <w:jc w:val="both"/>
-      </w:pPr>
-      <w:r>
-        <w:rPr>
-          <w:rFonts w:ascii="Times New Roman" w:hAnsi="Times New Roman"/>
-          <w:sz w:val="24"/>
-        </w:rPr>
-        <w:t>[1] React Documentation.</w:t>
-        <w:br/>
-        <w:t>[2] Supabase Data Management.</w:t>
-      </w:r>
-    </w:p>
     <w:sectPr>
       <w:headerReference w:type="default" r:id="rId9"/>
       <w:footerReference w:type="default" r:id="rId10"/>
@@ -2403,11 +1618,6 @@
       <w:jc w:val="left"/>
     </w:pPr>
     <w:r>
-      <w:rPr>
-        <w:rFonts w:ascii="Times New Roman" w:hAnsi="Times New Roman"/>
-        <w:b/>
-        <w:sz w:val="20"/>
-      </w:rPr>
       <w:t>————————————————————————————————————————————————————————————</w:t>
       <w:br/>
       <w:t>Janaprabha Institute of Engineering and Technology</w:t>
@@ -2429,11 +1639,6 @@
       <w:jc w:val="right"/>
     </w:pPr>
     <w:r>
-      <w:rPr>
-        <w:rFonts w:ascii="Times New Roman" w:hAnsi="Times New Roman"/>
-        <w:b/>
-        <w:sz w:val="20"/>
-      </w:rPr>
       <w:t>AI Resume Studio</w:t>
       <w:br/>
       <w:t>————————————————————————————————————————————————————————————</w:t>

</xml_diff>